<commit_message>
README, labelling guide generator, and a much faster OpenAlex stage
- resolve only the titles cited in related-work sections (2,938 of 17,546) and
  resolve them in parallel inside OpenAlex's polite-pool limits; this turns a
  five-hour step into roughly ten minutes and changes no output, because the
  citation-context rows only ever needed the title from the .bbl/.bib
- build_labelling_guide.py generates docs/labelling_guide.md from the taxonomy
  module, so the human guide and the LLM prompt cannot drift apart; the real
  per-label examples still have to be filled in
- strip markdown emphasis and backticks that were leaking into the report prose
- README with setup, the local run sequence, the Colab pointer, and the honesty
  rules the repository enforces mechanically
</commit_message>
<xml_diff>
--- a/report/LitReview_Report.docx
+++ b/report/LitReview_Report.docx
@@ -2996,7 +2996,7 @@
           <w:i w:val="0"/>
           <w:sz w:val="24"/>
         </w:rPr>
-        <w:t>The response in the summarisation literature has been to evaluate entailment rather than overlap. Question-answering-based consistency checks [3], classifier-based checks [4] and sentence-level natural-language-inference checks [5] all score a summary against its source instead of against a reference text. This project adopts that stance at the level of the individual sentence, and goes one step further by requiring the system to say *which* passage each sentence is supposed to follow from, so the check is well defined rather than approximate.</w:t>
+        <w:t>The response in the summarisation literature has been to evaluate entailment rather than overlap. Question-answering-based consistency checks [3], classifier-based checks [4] and sentence-level natural-language-inference checks [5] all score a summary against its source instead of against a reference text. This project adopts that stance at the level of the individual sentence, and goes one step further by requiring the system to say exactly which passage each sentence is supposed to follow from, so the check is well defined rather than approximate.</w:t>
       </w:r>
     </w:p>
     <w:p>
@@ -3467,7 +3467,7 @@
           <w:i w:val="0"/>
           <w:sz w:val="24"/>
         </w:rPr>
-        <w:t>Related-work generation is the sub-task this project evaluates, and it is older than the current generation of models. Abu-Ra'ed et al. [15] treated it as scientific document abstracting over the cited papers, and Hoang and Kan's successors, notably Wang et al. [16], introduced joint context-driven attention over the citing paper's own content and the cited abstracts. Luu et al. [17] framed the problem as explaining the *relationship* between two documents rather than summarising one of them, which is the framing closest to the relation classifier used here.</w:t>
+        <w:t>Related-work generation is the sub-task this project evaluates, and it is older than the current generation of models. Abu-Ra'ed et al. [15] treated it as scientific document abstracting over the cited papers, and Hoang and Kan's successors, notably Wang et al. [16], introduced joint context-driven attention over the citing paper's own content and the cited abstracts. Luu et al. [17] framed the problem as explaining the relationship between two documents rather than summarising one of them, which is the framing closest to the relation classifier used here.</w:t>
       </w:r>
     </w:p>
     <w:p>
@@ -3550,7 +3550,7 @@
           <w:i w:val="0"/>
           <w:sz w:val="24"/>
         </w:rPr>
-        <w:t>The taxonomy used here is finer than SciCite's and differently cut from ACL-ARC's, for a reason that matters downstream: this project needs to distinguish neutral comparison from asserted disagreement, because a `contrasts` edge is evidence of a contradiction while a `compares-against` edge is not. SciCite's `result` class and ACL-ARC's `CompareOrContrast` class both merge the two. Section 3.1 documents the mapping used to reuse those corpora as additional training signal, and the limits of that mapping; because of those limits, mapped rows are never used as evaluation gold.</w:t>
+        <w:t>The taxonomy used here is finer than SciCite's and differently cut from ACL-ARC's, for a reason that matters downstream: this project needs to distinguish neutral comparison from asserted disagreement, because a contrasts edge is evidence of a contradiction while a compares-against edge is not. SciCite's result class and ACL-ARC's CompareOrContrast class both merge the two. Section 3.1 documents the mapping used to reuse those corpora as additional training signal, and the limits of that mapping; because of those limits, mapped rows are never used as evaluation gold.</w:t>
       </w:r>
     </w:p>
     <w:p>
@@ -3633,7 +3633,7 @@
           <w:i w:val="0"/>
           <w:sz w:val="24"/>
         </w:rPr>
-        <w:t>The claim-verification literature supplies the other half of the picture. FEVER [29] established the retrieve-then-entail formulation at scale, SciFact [30] moved it into the scientific domain where claims are hedged and evidence is technical, and DeBERTa [31] provides the disentangled-attention encoder whose MNLI/FEVER/ANLI-trained checkpoints are used as the entailment model in Chapter 3. The survey of hallucination [2] ties the strands together and is the reference for the terminology used in this report: a claim is *unsupported* when the evidence does not entail it, which is weaker and more checkable than calling it false.</w:t>
+        <w:t>The claim-verification literature supplies the other half of the picture. FEVER [29] established the retrieve-then-entail formulation at scale, SciFact [30] moved it into the scientific domain where claims are hedged and evidence is technical, and DeBERTa [31] provides the disentangled-attention encoder whose MNLI/FEVER/ANLI-trained checkpoints are used as the entailment model in Chapter 3. The survey of hallucination [2] ties the strands together and is the reference for the terminology used in this report: a claim is unsupported when the evidence does not entail it, which is weaker and more checkable than calling it false.</w:t>
       </w:r>
     </w:p>
     <w:p>
@@ -4890,7 +4890,7 @@
           <w:i w:val="0"/>
           <w:sz w:val="24"/>
         </w:rPr>
-        <w:t>Three gaps follow, and they are what this project addresses. First, the faithfulness literature evaluates summaries against a source document, while the review-generation literature generates from many sources and evaluates against a reference text; almost nothing evaluates a *multi-source* review against the sources it cites, sentence by sentence. Second, citation-relation labels are used to study fields rather than to drive synthesis: no system known to us uses a `contrasts` prediction as evidence that two papers disagree and then asks an agent to adjudicate. Third, the cost of multi-agent pipelines is rarely reported next to their quality, so it is not possible to tell from the literature whether the extra calls are worth making.</w:t>
+        <w:t>Three gaps follow, and they are what this project addresses. First, the faithfulness literature evaluates summaries against a source document, while the review-generation literature generates from many sources and evaluates against a reference text; almost nothing evaluates a multi-source review against the sources it cites, sentence by sentence. Second, citation-relation labels are used to study fields rather than to drive synthesis: no system known to us uses a contrasts prediction as evidence that two papers disagree and then asks an agent to adjudicate. Third, the cost of multi-agent pipelines is rarely reported next to their quality, so it is not possible to tell from the literature whether the extra calls are worth making.</w:t>
       </w:r>
     </w:p>
     <w:p>

</xml_diff>

<commit_message>
Tune labelling throughput to the real token budget
Measured rather than assumed: the per-call estimate was inflated (3,800 against
an actual 2,300), which cost half the available throughput, and raising the batch
size made it worse rather than better. The limiter reserves from the estimate up
front, so two batch-of-16 reservations do not fit inside a 7,400-token minute and
only one call runs per minute even though real usage would allow nearly two.

- estimate from measurement: ~210 tokens per item plus ~550 for the shared
  taxonomy block and reply scaffold
- keep the batch at 8: several small reservations pack the per-minute budget far
  better than one large one, and the docstring now says so
- raise tpm to 7,400 against the account's real 8,000

Labelling went from 15 to 35 contexts a minute.

Also fix Chapter 4 to describe the three-source resolution (arXiv id, batched
DOI, title search) instead of the old title-only schema, which crashed the build
on a renamed key.
</commit_message>
<xml_diff>
--- a/report/LitReview_Report.docx
+++ b/report/LitReview_Report.docx
@@ -664,7 +664,7 @@
           <w:i w:val="0"/>
           <w:sz w:val="24"/>
         </w:rPr>
-        <w:t xml:space="preserve">Training and evaluation data are reverse-engineered from real papers: a paper's related-work section is a human-written mini literature review, so mining those sections together with the abstracts of the papers they cite yields both a supervision signal and a natural benchmark. Stage 1 mining statistics were not available when this report was built. </w:t>
+        <w:t xml:space="preserve">Training and evaluation data are reverse-engineered from real papers: a paper's related-work section is a human-written mini literature review, so mining those sections together with the abstracts of the papers they cite yields both a supervision signal and a natural benchmark. From 200 arXiv cs.CL and cs.IR submissions the pipeline produced 15,704 citation contexts and 80 usable related-work benchmark examples. </w:t>
       </w:r>
     </w:p>
     <w:p>
@@ -2412,6 +2412,122 @@
           </w:p>
         </w:tc>
       </w:tr>
+      <w:tr>
+        <w:tc>
+          <w:tcPr>
+            <w:tcW w:type="dxa" w:w="1152"/>
+          </w:tcPr>
+          <w:p>
+            <w:pPr>
+              <w:spacing w:after="20" w:line="240" w:lineRule="auto"/>
+            </w:pPr>
+            <w:r/>
+            <w:r>
+              <w:rPr>
+                <w:b w:val="0"/>
+                <w:sz w:val="20"/>
+              </w:rPr>
+              <w:t>Table 3</w:t>
+            </w:r>
+          </w:p>
+        </w:tc>
+        <w:tc>
+          <w:tcPr>
+            <w:tcW w:type="dxa" w:w="6912"/>
+          </w:tcPr>
+          <w:p>
+            <w:pPr>
+              <w:spacing w:after="20" w:line="240" w:lineRule="auto"/>
+            </w:pPr>
+            <w:r/>
+            <w:r>
+              <w:rPr>
+                <w:b w:val="0"/>
+                <w:sz w:val="20"/>
+              </w:rPr>
+              <w:t>Stage 1 mining yield at pilot scale</w:t>
+            </w:r>
+          </w:p>
+        </w:tc>
+        <w:tc>
+          <w:tcPr>
+            <w:tcW w:type="dxa" w:w="1007"/>
+          </w:tcPr>
+          <w:p>
+            <w:pPr>
+              <w:spacing w:after="20" w:line="240" w:lineRule="auto"/>
+              <w:jc w:val="right"/>
+            </w:pPr>
+            <w:r/>
+            <w:fldSimple w:instr=" PAGEREF _table_3 \h ">
+              <w:r>
+                <w:rPr>
+                  <w:sz w:val="20"/>
+                </w:rPr>
+                <w:t>1</w:t>
+              </w:r>
+            </w:fldSimple>
+          </w:p>
+        </w:tc>
+      </w:tr>
+      <w:tr>
+        <w:tc>
+          <w:tcPr>
+            <w:tcW w:type="dxa" w:w="1152"/>
+          </w:tcPr>
+          <w:p>
+            <w:pPr>
+              <w:spacing w:after="20" w:line="240" w:lineRule="auto"/>
+            </w:pPr>
+            <w:r/>
+            <w:r>
+              <w:rPr>
+                <w:b w:val="0"/>
+                <w:sz w:val="20"/>
+              </w:rPr>
+              <w:t>Table 4</w:t>
+            </w:r>
+          </w:p>
+        </w:tc>
+        <w:tc>
+          <w:tcPr>
+            <w:tcW w:type="dxa" w:w="6912"/>
+          </w:tcPr>
+          <w:p>
+            <w:pPr>
+              <w:spacing w:after="20" w:line="240" w:lineRule="auto"/>
+            </w:pPr>
+            <w:r/>
+            <w:r>
+              <w:rPr>
+                <w:b w:val="0"/>
+                <w:sz w:val="20"/>
+              </w:rPr>
+              <w:t>Dataset statistics for the mined arXiv benchmark and the external Multi-XScience benchmark</w:t>
+            </w:r>
+          </w:p>
+        </w:tc>
+        <w:tc>
+          <w:tcPr>
+            <w:tcW w:type="dxa" w:w="1007"/>
+          </w:tcPr>
+          <w:p>
+            <w:pPr>
+              <w:spacing w:after="20" w:line="240" w:lineRule="auto"/>
+              <w:jc w:val="right"/>
+            </w:pPr>
+            <w:r/>
+            <w:fldSimple w:instr=" PAGEREF _table_4 \h ">
+              <w:r>
+                <w:rPr>
+                  <w:sz w:val="20"/>
+                </w:rPr>
+                <w:t>1</w:t>
+              </w:r>
+            </w:fldSimple>
+          </w:p>
+        </w:tc>
+      </w:tr>
     </w:tbl>
     <w:p>
       <w:pPr>
@@ -2738,6 +2854,122 @@
             </w:pPr>
             <w:r/>
             <w:fldSimple w:instr=" PAGEREF _figure_3 \h ">
+              <w:r>
+                <w:rPr>
+                  <w:sz w:val="20"/>
+                </w:rPr>
+                <w:t>1</w:t>
+              </w:r>
+            </w:fldSimple>
+          </w:p>
+        </w:tc>
+      </w:tr>
+      <w:tr>
+        <w:tc>
+          <w:tcPr>
+            <w:tcW w:type="dxa" w:w="1152"/>
+          </w:tcPr>
+          <w:p>
+            <w:pPr>
+              <w:spacing w:after="20" w:line="240" w:lineRule="auto"/>
+            </w:pPr>
+            <w:r/>
+            <w:r>
+              <w:rPr>
+                <w:b w:val="0"/>
+                <w:sz w:val="20"/>
+              </w:rPr>
+              <w:t>Figure 4</w:t>
+            </w:r>
+          </w:p>
+        </w:tc>
+        <w:tc>
+          <w:tcPr>
+            <w:tcW w:type="dxa" w:w="6912"/>
+          </w:tcPr>
+          <w:p>
+            <w:pPr>
+              <w:spacing w:after="20" w:line="240" w:lineRule="auto"/>
+            </w:pPr>
+            <w:r/>
+            <w:r>
+              <w:rPr>
+                <w:b w:val="0"/>
+                <w:sz w:val="20"/>
+              </w:rPr>
+              <w:t>Mining yield: papers surviving each step, as counts and as a percentage of the submissions listed</w:t>
+            </w:r>
+          </w:p>
+        </w:tc>
+        <w:tc>
+          <w:tcPr>
+            <w:tcW w:type="dxa" w:w="1007"/>
+          </w:tcPr>
+          <w:p>
+            <w:pPr>
+              <w:spacing w:after="20" w:line="240" w:lineRule="auto"/>
+              <w:jc w:val="right"/>
+            </w:pPr>
+            <w:r/>
+            <w:fldSimple w:instr=" PAGEREF _figure_4 \h ">
+              <w:r>
+                <w:rPr>
+                  <w:sz w:val="20"/>
+                </w:rPr>
+                <w:t>1</w:t>
+              </w:r>
+            </w:fldSimple>
+          </w:p>
+        </w:tc>
+      </w:tr>
+      <w:tr>
+        <w:tc>
+          <w:tcPr>
+            <w:tcW w:type="dxa" w:w="1152"/>
+          </w:tcPr>
+          <w:p>
+            <w:pPr>
+              <w:spacing w:after="20" w:line="240" w:lineRule="auto"/>
+            </w:pPr>
+            <w:r/>
+            <w:r>
+              <w:rPr>
+                <w:b w:val="0"/>
+                <w:sz w:val="20"/>
+              </w:rPr>
+              <w:t>Figure 5</w:t>
+            </w:r>
+          </w:p>
+        </w:tc>
+        <w:tc>
+          <w:tcPr>
+            <w:tcW w:type="dxa" w:w="6912"/>
+          </w:tcPr>
+          <w:p>
+            <w:pPr>
+              <w:spacing w:after="20" w:line="240" w:lineRule="auto"/>
+            </w:pPr>
+            <w:r/>
+            <w:r>
+              <w:rPr>
+                <w:b w:val="0"/>
+                <w:sz w:val="20"/>
+              </w:rPr>
+              <w:t>Distribution of related-work length, number of cited papers and abstract coverage across the mined benchmark examples</w:t>
+            </w:r>
+          </w:p>
+        </w:tc>
+        <w:tc>
+          <w:tcPr>
+            <w:tcW w:type="dxa" w:w="1007"/>
+          </w:tcPr>
+          <w:p>
+            <w:pPr>
+              <w:spacing w:after="20" w:line="240" w:lineRule="auto"/>
+              <w:jc w:val="right"/>
+            </w:pPr>
+            <w:r/>
+            <w:fldSimple w:instr=" PAGEREF _figure_5 \h ">
               <w:r>
                 <w:rPr>
                   <w:sz w:val="20"/>
@@ -7455,7 +7687,7 @@
     <w:p>
       <w:pPr>
         <w:spacing w:after="120" w:line="300" w:lineRule="auto" w:before="200"/>
-        <w:ind w:left="360" w:firstLine="0"/>
+        <w:ind w:left="360" w:firstLine="432"/>
         <w:jc w:val="both"/>
         <w:rPr>
           <w:b/>
@@ -7467,10 +7699,1115 @@
       <w:r>
         <w:rPr>
           <w:b w:val="0"/>
+          <w:i w:val="0"/>
+          <w:sz w:val="24"/>
+        </w:rPr>
+        <w:t>The pilot listed 200 arXiv submissions in cs.CL and cs.IR (150 from the training window 202301–202412 and 50 from the test window 202606–202609). Of those, 189 had usable LaTeX source (94%); the remainder are PDF-only submissions, which arXiv permits and which no parser can recover. 189 parsed successfully and 155 had an identifiable related-work section (78% of papers listed). After requiring at least three cited works and at least 60% abstract coverage, 80 papers remain as benchmark examples and 15,704 citation contexts were written. Figure 4 shows the attrition at each step.</w:t>
+      </w:r>
+    </w:p>
+    <w:p>
+      <w:pPr>
+        <w:spacing w:after="120" w:line="300" w:lineRule="auto" w:before="200"/>
+        <w:ind w:left="360" w:firstLine="432"/>
+        <w:jc w:val="both"/>
+        <w:rPr>
+          <w:b/>
+          <w:bCs/>
+          <w:sz w:val="28"/>
+          <w:szCs w:val="24"/>
+        </w:rPr>
+      </w:pPr>
+      <w:r>
+        <w:rPr>
+          <w:b w:val="0"/>
+          <w:i w:val="0"/>
+          <w:sz w:val="24"/>
+        </w:rPr>
+        <w:t>References are resolved by identifier first and by title only as a fallback, because an identifier resolves a reference exactly where a title match resolves it merely probably, and because the fallback is what costs money. Of the references cited from related-work sections, 1,124 carried an arXiv identifier and all 1,124 of them resolved through the arXiv API, every one with an abstract; for a corpus mined from arXiv this is also the more authoritative source, since it returns the abstract of the version actually cited. A further 738 carried a DOI, resolved fifty at a time through OpenAlex, of which 198 came back (160 with an abstract). That left 1,830 references with no identifier at all, which had to be resolved by title search; 505 matched above the similarity floor of 88 and 450 of those yielded an abstract. The title-search pass did not finish: OpenAlex's free tier is a small daily budget per key, and it ran out partway through. Every reference resolved so far is cached, so re-running after the reset continues rather than restarts, and the benchmark reported below is therefore a lower bound on what this corpus yields. The gap between a reference being identified and its abstract being retrievable is the main reason benchmark examples are dropped, since a paper can be identified without an abstract being available to redistribute.</w:t>
+      </w:r>
+    </w:p>
+    <w:p>
+      <w:pPr>
+        <w:spacing w:after="40" w:line="300" w:lineRule="auto" w:before="160"/>
+        <w:ind w:left="0" w:firstLine="0"/>
+        <w:jc w:val="center"/>
+        <w:rPr>
+          <w:b/>
+          <w:bCs/>
+          <w:sz w:val="28"/>
+          <w:szCs w:val="24"/>
+        </w:rPr>
+      </w:pPr>
+      <w:r>
+        <w:drawing>
+          <wp:inline xmlns:a="http://schemas.openxmlformats.org/drawingml/2006/main" xmlns:pic="http://schemas.openxmlformats.org/drawingml/2006/picture">
+            <wp:extent cx="5303520" cy="2822341"/>
+            <wp:docPr id="1432113164" name="Picture 1432113164"/>
+            <wp:cNvGraphicFramePr>
+              <a:graphicFrameLocks noChangeAspect="1"/>
+            </wp:cNvGraphicFramePr>
+            <a:graphic>
+              <a:graphicData uri="http://schemas.openxmlformats.org/drawingml/2006/picture">
+                <pic:pic>
+                  <pic:nvPicPr>
+                    <pic:cNvPr id="0" name="fig_stage1_yield.png"/>
+                    <pic:cNvPicPr/>
+                  </pic:nvPicPr>
+                  <pic:blipFill>
+                    <a:blip r:embed="rId26"/>
+                    <a:stretch>
+                      <a:fillRect/>
+                    </a:stretch>
+                  </pic:blipFill>
+                  <pic:spPr>
+                    <a:xfrm>
+                      <a:off x="0" y="0"/>
+                      <a:ext cx="5303520" cy="2822341"/>
+                    </a:xfrm>
+                    <a:prstGeom prst="rect"/>
+                  </pic:spPr>
+                </pic:pic>
+              </a:graphicData>
+            </a:graphic>
+          </wp:inline>
+        </w:drawing>
+      </w:r>
+    </w:p>
+    <w:p>
+      <w:bookmarkStart w:id="1022" w:name="_figure_4"/>
+      <w:pPr>
+        <w:spacing w:after="200" w:line="300" w:lineRule="auto" w:before="160"/>
+        <w:ind w:left="0" w:firstLine="0"/>
+        <w:jc w:val="center"/>
+        <w:rPr>
+          <w:b/>
+          <w:bCs/>
+          <w:sz w:val="28"/>
+          <w:szCs w:val="24"/>
+        </w:rPr>
+      </w:pPr>
+      <w:r>
+        <w:rPr>
           <w:i/>
-          <w:sz w:val="24"/>
-        </w:rPr>
-        <w:t>Stage 1 mining is not reported here. results/stage1_yield.json is absent. Re-run it with python scripts/run_stage1.py --n-train 150 --n-test 50, then rebuild this report; the text and the table will appear automatically.</w:t>
+          <w:sz w:val="20"/>
+        </w:rPr>
+        <w:t>Figure 4: Mining yield: papers surviving each step, as counts and as a percentage of the submissions listed.</w:t>
+      </w:r>
+      <w:bookmarkEnd w:id="1022"/>
+    </w:p>
+    <w:p>
+      <w:pPr>
+        <w:spacing w:after="40" w:line="300" w:lineRule="auto" w:before="160"/>
+        <w:ind w:left="0" w:firstLine="0"/>
+        <w:jc w:val="center"/>
+        <w:rPr>
+          <w:b/>
+          <w:bCs/>
+          <w:sz w:val="28"/>
+          <w:szCs w:val="24"/>
+        </w:rPr>
+      </w:pPr>
+      <w:r>
+        <w:drawing>
+          <wp:inline xmlns:a="http://schemas.openxmlformats.org/drawingml/2006/main" xmlns:pic="http://schemas.openxmlformats.org/drawingml/2006/picture">
+            <wp:extent cx="5303520" cy="1688142"/>
+            <wp:docPr id="1432113165" name="Picture 1432113165"/>
+            <wp:cNvGraphicFramePr>
+              <a:graphicFrameLocks noChangeAspect="1"/>
+            </wp:cNvGraphicFramePr>
+            <a:graphic>
+              <a:graphicData uri="http://schemas.openxmlformats.org/drawingml/2006/picture">
+                <pic:pic>
+                  <pic:nvPicPr>
+                    <pic:cNvPr id="0" name="fig_dataset_stats.png"/>
+                    <pic:cNvPicPr/>
+                  </pic:nvPicPr>
+                  <pic:blipFill>
+                    <a:blip r:embed="rId27"/>
+                    <a:stretch>
+                      <a:fillRect/>
+                    </a:stretch>
+                  </pic:blipFill>
+                  <pic:spPr>
+                    <a:xfrm>
+                      <a:off x="0" y="0"/>
+                      <a:ext cx="5303520" cy="1688142"/>
+                    </a:xfrm>
+                    <a:prstGeom prst="rect"/>
+                  </pic:spPr>
+                </pic:pic>
+              </a:graphicData>
+            </a:graphic>
+          </wp:inline>
+        </w:drawing>
+      </w:r>
+    </w:p>
+    <w:p>
+      <w:bookmarkStart w:id="1023" w:name="_figure_5"/>
+      <w:pPr>
+        <w:spacing w:after="200" w:line="300" w:lineRule="auto" w:before="160"/>
+        <w:ind w:left="0" w:firstLine="0"/>
+        <w:jc w:val="center"/>
+        <w:rPr>
+          <w:b/>
+          <w:bCs/>
+          <w:sz w:val="28"/>
+          <w:szCs w:val="24"/>
+        </w:rPr>
+      </w:pPr>
+      <w:r>
+        <w:rPr>
+          <w:i/>
+          <w:sz w:val="20"/>
+        </w:rPr>
+        <w:t>Figure 5: Distribution of related-work length, number of cited papers and abstract coverage across the mined benchmark examples.</w:t>
+      </w:r>
+      <w:bookmarkEnd w:id="1023"/>
+    </w:p>
+    <w:p>
+      <w:bookmarkStart w:id="1024" w:name="_table_3"/>
+      <w:pPr>
+        <w:spacing w:after="60" w:line="300" w:lineRule="auto" w:before="160"/>
+        <w:ind w:left="0" w:firstLine="0"/>
+        <w:jc w:val="center"/>
+        <w:rPr>
+          <w:b/>
+          <w:bCs/>
+          <w:sz w:val="28"/>
+          <w:szCs w:val="24"/>
+        </w:rPr>
+      </w:pPr>
+      <w:r>
+        <w:rPr>
+          <w:i/>
+          <w:sz w:val="20"/>
+        </w:rPr>
+        <w:t>Table 3: Stage 1 mining yield at pilot scale.</w:t>
+      </w:r>
+      <w:bookmarkEnd w:id="1024"/>
+    </w:p>
+    <w:tbl>
+      <w:tblPr>
+        <w:tblStyle w:val="TableGrid"/>
+        <w:tblW w:type="auto" w:w="0"/>
+        <w:tblLayout w:type="autofit"/>
+        <w:tblLook w:firstColumn="1" w:firstRow="1" w:lastColumn="0" w:lastRow="0" w:noHBand="0" w:noVBand="1" w:val="04A0"/>
+      </w:tblPr>
+      <w:tblGrid>
+        <w:gridCol w:w="3010"/>
+        <w:gridCol w:w="3010"/>
+        <w:gridCol w:w="3010"/>
+      </w:tblGrid>
+      <w:tr>
+        <w:tc>
+          <w:tcPr>
+            <w:tcW w:type="dxa" w:w="4032"/>
+          </w:tcPr>
+          <w:p>
+            <w:pPr>
+              <w:spacing w:after="20" w:before="20" w:line="240" w:lineRule="auto"/>
+            </w:pPr>
+            <w:r/>
+            <w:r>
+              <w:rPr>
+                <w:b/>
+                <w:sz w:val="19"/>
+              </w:rPr>
+              <w:t>Step</w:t>
+            </w:r>
+          </w:p>
+        </w:tc>
+        <w:tc>
+          <w:tcPr>
+            <w:tcW w:type="dxa" w:w="1728"/>
+          </w:tcPr>
+          <w:p>
+            <w:pPr>
+              <w:spacing w:after="20" w:before="20" w:line="240" w:lineRule="auto"/>
+            </w:pPr>
+            <w:r/>
+            <w:r>
+              <w:rPr>
+                <w:b/>
+                <w:sz w:val="19"/>
+              </w:rPr>
+              <w:t>Papers</w:t>
+            </w:r>
+          </w:p>
+        </w:tc>
+        <w:tc>
+          <w:tcPr>
+            <w:tcW w:type="dxa" w:w="1728"/>
+          </w:tcPr>
+          <w:p>
+            <w:pPr>
+              <w:spacing w:after="20" w:before="20" w:line="240" w:lineRule="auto"/>
+            </w:pPr>
+            <w:r/>
+            <w:r>
+              <w:rPr>
+                <w:b/>
+                <w:sz w:val="19"/>
+              </w:rPr>
+              <w:t>% of listed</w:t>
+            </w:r>
+          </w:p>
+        </w:tc>
+      </w:tr>
+      <w:tr>
+        <w:tc>
+          <w:tcPr>
+            <w:tcW w:type="dxa" w:w="4032"/>
+          </w:tcPr>
+          <w:p>
+            <w:pPr>
+              <w:spacing w:after="20" w:before="20" w:line="240" w:lineRule="auto"/>
+            </w:pPr>
+            <w:r/>
+            <w:r>
+              <w:rPr>
+                <w:b w:val="0"/>
+                <w:sz w:val="19"/>
+              </w:rPr>
+              <w:t>Submissions listed</w:t>
+            </w:r>
+          </w:p>
+        </w:tc>
+        <w:tc>
+          <w:tcPr>
+            <w:tcW w:type="dxa" w:w="1728"/>
+          </w:tcPr>
+          <w:p>
+            <w:pPr>
+              <w:spacing w:after="20" w:before="20" w:line="240" w:lineRule="auto"/>
+              <w:jc w:val="right"/>
+            </w:pPr>
+            <w:r/>
+            <w:r>
+              <w:rPr>
+                <w:b w:val="0"/>
+                <w:sz w:val="19"/>
+              </w:rPr>
+              <w:t>200</w:t>
+            </w:r>
+          </w:p>
+        </w:tc>
+        <w:tc>
+          <w:tcPr>
+            <w:tcW w:type="dxa" w:w="1728"/>
+          </w:tcPr>
+          <w:p>
+            <w:pPr>
+              <w:spacing w:after="20" w:before="20" w:line="240" w:lineRule="auto"/>
+              <w:jc w:val="right"/>
+            </w:pPr>
+            <w:r/>
+            <w:r>
+              <w:rPr>
+                <w:b w:val="0"/>
+                <w:sz w:val="19"/>
+              </w:rPr>
+              <w:t>100.0%</w:t>
+            </w:r>
+          </w:p>
+        </w:tc>
+      </w:tr>
+      <w:tr>
+        <w:tc>
+          <w:tcPr>
+            <w:tcW w:type="dxa" w:w="4032"/>
+          </w:tcPr>
+          <w:p>
+            <w:pPr>
+              <w:spacing w:after="20" w:before="20" w:line="240" w:lineRule="auto"/>
+            </w:pPr>
+            <w:r/>
+            <w:r>
+              <w:rPr>
+                <w:b w:val="0"/>
+                <w:sz w:val="19"/>
+              </w:rPr>
+              <w:t>With LaTeX source</w:t>
+            </w:r>
+          </w:p>
+        </w:tc>
+        <w:tc>
+          <w:tcPr>
+            <w:tcW w:type="dxa" w:w="1728"/>
+          </w:tcPr>
+          <w:p>
+            <w:pPr>
+              <w:spacing w:after="20" w:before="20" w:line="240" w:lineRule="auto"/>
+              <w:jc w:val="right"/>
+            </w:pPr>
+            <w:r/>
+            <w:r>
+              <w:rPr>
+                <w:b w:val="0"/>
+                <w:sz w:val="19"/>
+              </w:rPr>
+              <w:t>189</w:t>
+            </w:r>
+          </w:p>
+        </w:tc>
+        <w:tc>
+          <w:tcPr>
+            <w:tcW w:type="dxa" w:w="1728"/>
+          </w:tcPr>
+          <w:p>
+            <w:pPr>
+              <w:spacing w:after="20" w:before="20" w:line="240" w:lineRule="auto"/>
+              <w:jc w:val="right"/>
+            </w:pPr>
+            <w:r/>
+            <w:r>
+              <w:rPr>
+                <w:b w:val="0"/>
+                <w:sz w:val="19"/>
+              </w:rPr>
+              <w:t>94.5%</w:t>
+            </w:r>
+          </w:p>
+        </w:tc>
+      </w:tr>
+      <w:tr>
+        <w:tc>
+          <w:tcPr>
+            <w:tcW w:type="dxa" w:w="4032"/>
+          </w:tcPr>
+          <w:p>
+            <w:pPr>
+              <w:spacing w:after="20" w:before="20" w:line="240" w:lineRule="auto"/>
+            </w:pPr>
+            <w:r/>
+            <w:r>
+              <w:rPr>
+                <w:b w:val="0"/>
+                <w:sz w:val="19"/>
+              </w:rPr>
+              <w:t>Parsed without error</w:t>
+            </w:r>
+          </w:p>
+        </w:tc>
+        <w:tc>
+          <w:tcPr>
+            <w:tcW w:type="dxa" w:w="1728"/>
+          </w:tcPr>
+          <w:p>
+            <w:pPr>
+              <w:spacing w:after="20" w:before="20" w:line="240" w:lineRule="auto"/>
+              <w:jc w:val="right"/>
+            </w:pPr>
+            <w:r/>
+            <w:r>
+              <w:rPr>
+                <w:b w:val="0"/>
+                <w:sz w:val="19"/>
+              </w:rPr>
+              <w:t>189</w:t>
+            </w:r>
+          </w:p>
+        </w:tc>
+        <w:tc>
+          <w:tcPr>
+            <w:tcW w:type="dxa" w:w="1728"/>
+          </w:tcPr>
+          <w:p>
+            <w:pPr>
+              <w:spacing w:after="20" w:before="20" w:line="240" w:lineRule="auto"/>
+              <w:jc w:val="right"/>
+            </w:pPr>
+            <w:r/>
+            <w:r>
+              <w:rPr>
+                <w:b w:val="0"/>
+                <w:sz w:val="19"/>
+              </w:rPr>
+              <w:t>94.5%</w:t>
+            </w:r>
+          </w:p>
+        </w:tc>
+      </w:tr>
+      <w:tr>
+        <w:tc>
+          <w:tcPr>
+            <w:tcW w:type="dxa" w:w="4032"/>
+          </w:tcPr>
+          <w:p>
+            <w:pPr>
+              <w:spacing w:after="20" w:before="20" w:line="240" w:lineRule="auto"/>
+            </w:pPr>
+            <w:r/>
+            <w:r>
+              <w:rPr>
+                <w:b w:val="0"/>
+                <w:sz w:val="19"/>
+              </w:rPr>
+              <w:t>With a related-work section</w:t>
+            </w:r>
+          </w:p>
+        </w:tc>
+        <w:tc>
+          <w:tcPr>
+            <w:tcW w:type="dxa" w:w="1728"/>
+          </w:tcPr>
+          <w:p>
+            <w:pPr>
+              <w:spacing w:after="20" w:before="20" w:line="240" w:lineRule="auto"/>
+              <w:jc w:val="right"/>
+            </w:pPr>
+            <w:r/>
+            <w:r>
+              <w:rPr>
+                <w:b w:val="0"/>
+                <w:sz w:val="19"/>
+              </w:rPr>
+              <w:t>155</w:t>
+            </w:r>
+          </w:p>
+        </w:tc>
+        <w:tc>
+          <w:tcPr>
+            <w:tcW w:type="dxa" w:w="1728"/>
+          </w:tcPr>
+          <w:p>
+            <w:pPr>
+              <w:spacing w:after="20" w:before="20" w:line="240" w:lineRule="auto"/>
+              <w:jc w:val="right"/>
+            </w:pPr>
+            <w:r/>
+            <w:r>
+              <w:rPr>
+                <w:b w:val="0"/>
+                <w:sz w:val="19"/>
+              </w:rPr>
+              <w:t>77.5%</w:t>
+            </w:r>
+          </w:p>
+        </w:tc>
+      </w:tr>
+      <w:tr>
+        <w:tc>
+          <w:tcPr>
+            <w:tcW w:type="dxa" w:w="4032"/>
+          </w:tcPr>
+          <w:p>
+            <w:pPr>
+              <w:spacing w:after="20" w:before="20" w:line="240" w:lineRule="auto"/>
+            </w:pPr>
+            <w:r/>
+            <w:r>
+              <w:rPr>
+                <w:b w:val="0"/>
+                <w:sz w:val="19"/>
+              </w:rPr>
+              <w:t>Kept as benchmark examples</w:t>
+            </w:r>
+          </w:p>
+        </w:tc>
+        <w:tc>
+          <w:tcPr>
+            <w:tcW w:type="dxa" w:w="1728"/>
+          </w:tcPr>
+          <w:p>
+            <w:pPr>
+              <w:spacing w:after="20" w:before="20" w:line="240" w:lineRule="auto"/>
+              <w:jc w:val="right"/>
+            </w:pPr>
+            <w:r/>
+            <w:r>
+              <w:rPr>
+                <w:b w:val="0"/>
+                <w:sz w:val="19"/>
+              </w:rPr>
+              <w:t>80</w:t>
+            </w:r>
+          </w:p>
+        </w:tc>
+        <w:tc>
+          <w:tcPr>
+            <w:tcW w:type="dxa" w:w="1728"/>
+          </w:tcPr>
+          <w:p>
+            <w:pPr>
+              <w:spacing w:after="20" w:before="20" w:line="240" w:lineRule="auto"/>
+              <w:jc w:val="right"/>
+            </w:pPr>
+            <w:r/>
+            <w:r>
+              <w:rPr>
+                <w:b w:val="0"/>
+                <w:sz w:val="19"/>
+              </w:rPr>
+              <w:t>40.0%</w:t>
+            </w:r>
+          </w:p>
+        </w:tc>
+      </w:tr>
+    </w:tbl>
+    <w:p>
+      <w:pPr>
+        <w:spacing w:after="60" w:line="300" w:lineRule="auto" w:before="160"/>
+        <w:ind w:left="0" w:firstLine="0"/>
+        <w:jc w:val="center"/>
+        <w:rPr>
+          <w:b/>
+          <w:bCs/>
+          <w:sz w:val="28"/>
+          <w:szCs w:val="24"/>
+        </w:rPr>
+      </w:pPr>
+    </w:p>
+    <w:p>
+      <w:bookmarkStart w:id="1025" w:name="_table_4"/>
+      <w:pPr>
+        <w:spacing w:after="60" w:line="300" w:lineRule="auto" w:before="160"/>
+        <w:ind w:left="0" w:firstLine="0"/>
+        <w:jc w:val="center"/>
+        <w:rPr>
+          <w:b/>
+          <w:bCs/>
+          <w:sz w:val="28"/>
+          <w:szCs w:val="24"/>
+        </w:rPr>
+      </w:pPr>
+      <w:r>
+        <w:rPr>
+          <w:i/>
+          <w:sz w:val="20"/>
+        </w:rPr>
+        <w:t>Table 4: Dataset statistics for the mined arXiv benchmark and the external Multi-XScience benchmark.</w:t>
+      </w:r>
+      <w:bookmarkEnd w:id="1025"/>
+    </w:p>
+    <w:tbl>
+      <w:tblPr>
+        <w:tblStyle w:val="TableGrid"/>
+        <w:tblW w:type="auto" w:w="0"/>
+        <w:tblLayout w:type="autofit"/>
+        <w:tblLook w:firstColumn="1" w:firstRow="1" w:lastColumn="0" w:lastRow="0" w:noHBand="0" w:noVBand="1" w:val="04A0"/>
+      </w:tblPr>
+      <w:tblGrid>
+        <w:gridCol w:w="3010"/>
+        <w:gridCol w:w="3010"/>
+        <w:gridCol w:w="3010"/>
+      </w:tblGrid>
+      <w:tr>
+        <w:tc>
+          <w:tcPr>
+            <w:tcW w:type="dxa" w:w="4176"/>
+          </w:tcPr>
+          <w:p>
+            <w:pPr>
+              <w:spacing w:after="20" w:before="20" w:line="240" w:lineRule="auto"/>
+            </w:pPr>
+            <w:r/>
+            <w:r>
+              <w:rPr>
+                <w:b/>
+                <w:sz w:val="19"/>
+              </w:rPr>
+              <w:t>Statistic</w:t>
+            </w:r>
+          </w:p>
+        </w:tc>
+        <w:tc>
+          <w:tcPr>
+            <w:tcW w:type="dxa" w:w="1872"/>
+          </w:tcPr>
+          <w:p>
+            <w:pPr>
+              <w:spacing w:after="20" w:before="20" w:line="240" w:lineRule="auto"/>
+            </w:pPr>
+            <w:r/>
+            <w:r>
+              <w:rPr>
+                <w:b/>
+                <w:sz w:val="19"/>
+              </w:rPr>
+              <w:t>Mined arXiv split</w:t>
+            </w:r>
+          </w:p>
+        </w:tc>
+        <w:tc>
+          <w:tcPr>
+            <w:tcW w:type="dxa" w:w="1872"/>
+          </w:tcPr>
+          <w:p>
+            <w:pPr>
+              <w:spacing w:after="20" w:before="20" w:line="240" w:lineRule="auto"/>
+            </w:pPr>
+            <w:r/>
+            <w:r>
+              <w:rPr>
+                <w:b/>
+                <w:sz w:val="19"/>
+              </w:rPr>
+              <w:t>Multi-XScience</w:t>
+            </w:r>
+          </w:p>
+        </w:tc>
+      </w:tr>
+      <w:tr>
+        <w:tc>
+          <w:tcPr>
+            <w:tcW w:type="dxa" w:w="4176"/>
+          </w:tcPr>
+          <w:p>
+            <w:pPr>
+              <w:spacing w:after="20" w:before="20" w:line="240" w:lineRule="auto"/>
+            </w:pPr>
+            <w:r/>
+            <w:r>
+              <w:rPr>
+                <w:b w:val="0"/>
+                <w:sz w:val="19"/>
+              </w:rPr>
+              <w:t>Benchmark examples</w:t>
+            </w:r>
+          </w:p>
+        </w:tc>
+        <w:tc>
+          <w:tcPr>
+            <w:tcW w:type="dxa" w:w="1872"/>
+          </w:tcPr>
+          <w:p>
+            <w:pPr>
+              <w:spacing w:after="20" w:before="20" w:line="240" w:lineRule="auto"/>
+              <w:jc w:val="right"/>
+            </w:pPr>
+            <w:r/>
+            <w:r>
+              <w:rPr>
+                <w:b w:val="0"/>
+                <w:sz w:val="19"/>
+              </w:rPr>
+              <w:t>80</w:t>
+            </w:r>
+          </w:p>
+        </w:tc>
+        <w:tc>
+          <w:tcPr>
+            <w:tcW w:type="dxa" w:w="1872"/>
+          </w:tcPr>
+          <w:p>
+            <w:pPr>
+              <w:spacing w:after="20" w:before="20" w:line="240" w:lineRule="auto"/>
+              <w:jc w:val="right"/>
+            </w:pPr>
+            <w:r/>
+            <w:r>
+              <w:rPr>
+                <w:b w:val="0"/>
+                <w:sz w:val="19"/>
+              </w:rPr>
+              <w:t>300</w:t>
+            </w:r>
+          </w:p>
+        </w:tc>
+      </w:tr>
+      <w:tr>
+        <w:tc>
+          <w:tcPr>
+            <w:tcW w:type="dxa" w:w="4176"/>
+          </w:tcPr>
+          <w:p>
+            <w:pPr>
+              <w:spacing w:after="20" w:before="20" w:line="240" w:lineRule="auto"/>
+            </w:pPr>
+            <w:r/>
+            <w:r>
+              <w:rPr>
+                <w:b w:val="0"/>
+                <w:sz w:val="19"/>
+              </w:rPr>
+              <w:t>Median related-work length (words)</w:t>
+            </w:r>
+          </w:p>
+        </w:tc>
+        <w:tc>
+          <w:tcPr>
+            <w:tcW w:type="dxa" w:w="1872"/>
+          </w:tcPr>
+          <w:p>
+            <w:pPr>
+              <w:spacing w:after="20" w:before="20" w:line="240" w:lineRule="auto"/>
+              <w:jc w:val="right"/>
+            </w:pPr>
+            <w:r/>
+            <w:r>
+              <w:rPr>
+                <w:b w:val="0"/>
+                <w:sz w:val="19"/>
+              </w:rPr>
+              <w:t>420</w:t>
+            </w:r>
+          </w:p>
+        </w:tc>
+        <w:tc>
+          <w:tcPr>
+            <w:tcW w:type="dxa" w:w="1872"/>
+          </w:tcPr>
+          <w:p>
+            <w:pPr>
+              <w:spacing w:after="20" w:before="20" w:line="240" w:lineRule="auto"/>
+              <w:jc w:val="right"/>
+            </w:pPr>
+            <w:r/>
+            <w:r>
+              <w:rPr>
+                <w:b w:val="0"/>
+                <w:sz w:val="19"/>
+              </w:rPr>
+              <w:t>119</w:t>
+            </w:r>
+          </w:p>
+        </w:tc>
+      </w:tr>
+      <w:tr>
+        <w:tc>
+          <w:tcPr>
+            <w:tcW w:type="dxa" w:w="4176"/>
+          </w:tcPr>
+          <w:p>
+            <w:pPr>
+              <w:spacing w:after="20" w:before="20" w:line="240" w:lineRule="auto"/>
+            </w:pPr>
+            <w:r/>
+            <w:r>
+              <w:rPr>
+                <w:b w:val="0"/>
+                <w:sz w:val="19"/>
+              </w:rPr>
+              <w:t>Median papers cited per example</w:t>
+            </w:r>
+          </w:p>
+        </w:tc>
+        <w:tc>
+          <w:tcPr>
+            <w:tcW w:type="dxa" w:w="1872"/>
+          </w:tcPr>
+          <w:p>
+            <w:pPr>
+              <w:spacing w:after="20" w:before="20" w:line="240" w:lineRule="auto"/>
+              <w:jc w:val="right"/>
+            </w:pPr>
+            <w:r/>
+            <w:r>
+              <w:rPr>
+                <w:b w:val="0"/>
+                <w:sz w:val="19"/>
+              </w:rPr>
+              <w:t>20</w:t>
+            </w:r>
+          </w:p>
+        </w:tc>
+        <w:tc>
+          <w:tcPr>
+            <w:tcW w:type="dxa" w:w="1872"/>
+          </w:tcPr>
+          <w:p>
+            <w:pPr>
+              <w:spacing w:after="20" w:before="20" w:line="240" w:lineRule="auto"/>
+              <w:jc w:val="right"/>
+            </w:pPr>
+            <w:r/>
+            <w:r>
+              <w:rPr>
+                <w:b w:val="0"/>
+                <w:sz w:val="19"/>
+              </w:rPr>
+              <w:t>5</w:t>
+            </w:r>
+          </w:p>
+        </w:tc>
+      </w:tr>
+      <w:tr>
+        <w:tc>
+          <w:tcPr>
+            <w:tcW w:type="dxa" w:w="4176"/>
+          </w:tcPr>
+          <w:p>
+            <w:pPr>
+              <w:spacing w:after="20" w:before="20" w:line="240" w:lineRule="auto"/>
+            </w:pPr>
+            <w:r/>
+            <w:r>
+              <w:rPr>
+                <w:b w:val="0"/>
+                <w:sz w:val="19"/>
+              </w:rPr>
+              <w:t>Median abstract coverage</w:t>
+            </w:r>
+          </w:p>
+        </w:tc>
+        <w:tc>
+          <w:tcPr>
+            <w:tcW w:type="dxa" w:w="1872"/>
+          </w:tcPr>
+          <w:p>
+            <w:pPr>
+              <w:spacing w:after="20" w:before="20" w:line="240" w:lineRule="auto"/>
+              <w:jc w:val="right"/>
+            </w:pPr>
+            <w:r/>
+            <w:r>
+              <w:rPr>
+                <w:b w:val="0"/>
+                <w:sz w:val="19"/>
+              </w:rPr>
+              <w:t>0.74</w:t>
+            </w:r>
+          </w:p>
+        </w:tc>
+        <w:tc>
+          <w:tcPr>
+            <w:tcW w:type="dxa" w:w="1872"/>
+          </w:tcPr>
+          <w:p>
+            <w:pPr>
+              <w:spacing w:after="20" w:before="20" w:line="240" w:lineRule="auto"/>
+              <w:jc w:val="right"/>
+            </w:pPr>
+            <w:r/>
+            <w:r>
+              <w:rPr>
+                <w:b w:val="0"/>
+                <w:sz w:val="19"/>
+              </w:rPr>
+              <w:t>0.857</w:t>
+            </w:r>
+          </w:p>
+        </w:tc>
+      </w:tr>
+      <w:tr>
+        <w:tc>
+          <w:tcPr>
+            <w:tcW w:type="dxa" w:w="4176"/>
+          </w:tcPr>
+          <w:p>
+            <w:pPr>
+              <w:spacing w:after="20" w:before="20" w:line="240" w:lineRule="auto"/>
+            </w:pPr>
+            <w:r/>
+            <w:r>
+              <w:rPr>
+                <w:b w:val="0"/>
+                <w:sz w:val="19"/>
+              </w:rPr>
+              <w:t>Citation contexts</w:t>
+            </w:r>
+          </w:p>
+        </w:tc>
+        <w:tc>
+          <w:tcPr>
+            <w:tcW w:type="dxa" w:w="1872"/>
+          </w:tcPr>
+          <w:p>
+            <w:pPr>
+              <w:spacing w:after="20" w:before="20" w:line="240" w:lineRule="auto"/>
+              <w:jc w:val="right"/>
+            </w:pPr>
+            <w:r/>
+            <w:r>
+              <w:rPr>
+                <w:b w:val="0"/>
+                <w:sz w:val="19"/>
+              </w:rPr>
+              <w:t>15,704</w:t>
+            </w:r>
+          </w:p>
+        </w:tc>
+        <w:tc>
+          <w:tcPr>
+            <w:tcW w:type="dxa" w:w="1872"/>
+          </w:tcPr>
+          <w:p>
+            <w:pPr>
+              <w:spacing w:after="20" w:before="20" w:line="240" w:lineRule="auto"/>
+              <w:jc w:val="right"/>
+            </w:pPr>
+            <w:r/>
+            <w:r>
+              <w:rPr>
+                <w:b w:val="0"/>
+                <w:sz w:val="19"/>
+              </w:rPr>
+              <w:t>—</w:t>
+            </w:r>
+          </w:p>
+        </w:tc>
+      </w:tr>
+      <w:tr>
+        <w:tc>
+          <w:tcPr>
+            <w:tcW w:type="dxa" w:w="4176"/>
+          </w:tcPr>
+          <w:p>
+            <w:pPr>
+              <w:spacing w:after="20" w:before="20" w:line="240" w:lineRule="auto"/>
+            </w:pPr>
+            <w:r/>
+            <w:r>
+              <w:rPr>
+                <w:b w:val="0"/>
+                <w:sz w:val="19"/>
+              </w:rPr>
+              <w:t>… of which inside a related-work section</w:t>
+            </w:r>
+          </w:p>
+        </w:tc>
+        <w:tc>
+          <w:tcPr>
+            <w:tcW w:type="dxa" w:w="1872"/>
+          </w:tcPr>
+          <w:p>
+            <w:pPr>
+              <w:spacing w:after="20" w:before="20" w:line="240" w:lineRule="auto"/>
+              <w:jc w:val="right"/>
+            </w:pPr>
+            <w:r/>
+            <w:r>
+              <w:rPr>
+                <w:b w:val="0"/>
+                <w:sz w:val="19"/>
+              </w:rPr>
+              <w:t>3,652</w:t>
+            </w:r>
+          </w:p>
+        </w:tc>
+        <w:tc>
+          <w:tcPr>
+            <w:tcW w:type="dxa" w:w="1872"/>
+          </w:tcPr>
+          <w:p>
+            <w:pPr>
+              <w:spacing w:after="20" w:before="20" w:line="240" w:lineRule="auto"/>
+              <w:jc w:val="right"/>
+            </w:pPr>
+            <w:r/>
+            <w:r>
+              <w:rPr>
+                <w:b w:val="0"/>
+                <w:sz w:val="19"/>
+              </w:rPr>
+              <w:t>—</w:t>
+            </w:r>
+          </w:p>
+        </w:tc>
+      </w:tr>
+      <w:tr>
+        <w:tc>
+          <w:tcPr>
+            <w:tcW w:type="dxa" w:w="4176"/>
+          </w:tcPr>
+          <w:p>
+            <w:pPr>
+              <w:spacing w:after="20" w:before="20" w:line="240" w:lineRule="auto"/>
+            </w:pPr>
+            <w:r/>
+            <w:r>
+              <w:rPr>
+                <w:b w:val="0"/>
+                <w:sz w:val="19"/>
+              </w:rPr>
+              <w:t>Distinct citing papers</w:t>
+            </w:r>
+          </w:p>
+        </w:tc>
+        <w:tc>
+          <w:tcPr>
+            <w:tcW w:type="dxa" w:w="1872"/>
+          </w:tcPr>
+          <w:p>
+            <w:pPr>
+              <w:spacing w:after="20" w:before="20" w:line="240" w:lineRule="auto"/>
+              <w:jc w:val="right"/>
+            </w:pPr>
+            <w:r/>
+            <w:r>
+              <w:rPr>
+                <w:b w:val="0"/>
+                <w:sz w:val="19"/>
+              </w:rPr>
+              <w:t>185</w:t>
+            </w:r>
+          </w:p>
+        </w:tc>
+        <w:tc>
+          <w:tcPr>
+            <w:tcW w:type="dxa" w:w="1872"/>
+          </w:tcPr>
+          <w:p>
+            <w:pPr>
+              <w:spacing w:after="20" w:before="20" w:line="240" w:lineRule="auto"/>
+              <w:jc w:val="right"/>
+            </w:pPr>
+            <w:r/>
+            <w:r>
+              <w:rPr>
+                <w:b w:val="0"/>
+                <w:sz w:val="19"/>
+              </w:rPr>
+              <w:t>—</w:t>
+            </w:r>
+          </w:p>
+        </w:tc>
+      </w:tr>
+    </w:tbl>
+    <w:p>
+      <w:pPr>
+        <w:spacing w:after="60" w:line="300" w:lineRule="auto" w:before="160"/>
+        <w:ind w:left="0" w:firstLine="0"/>
+        <w:jc w:val="center"/>
+        <w:rPr>
+          <w:b/>
+          <w:bCs/>
+          <w:sz w:val="28"/>
+          <w:szCs w:val="24"/>
+        </w:rPr>
+      </w:pPr>
+    </w:p>
+    <w:p>
+      <w:pPr>
+        <w:spacing w:after="120" w:line="300" w:lineRule="auto" w:before="160"/>
+        <w:ind w:left="360" w:firstLine="432"/>
+        <w:jc w:val="both"/>
+        <w:rPr>
+          <w:b/>
+          <w:bCs/>
+          <w:sz w:val="28"/>
+          <w:szCs w:val="24"/>
+        </w:rPr>
+      </w:pPr>
+      <w:r>
+        <w:rPr>
+          <w:b w:val="0"/>
+          <w:i w:val="0"/>
+          <w:sz w:val="24"/>
+        </w:rPr>
+        <w:t>The time split is disjoint: the newest training paper is dated 2024-12-31 and the oldest test paper 2026-06-30.</w:t>
+      </w:r>
+    </w:p>
+    <w:p>
+      <w:pPr>
+        <w:spacing w:after="120" w:line="300" w:lineRule="auto" w:before="160"/>
+        <w:ind w:left="360" w:firstLine="432"/>
+        <w:jc w:val="both"/>
+        <w:rPr>
+          <w:b/>
+          <w:bCs/>
+          <w:sz w:val="28"/>
+          <w:szCs w:val="24"/>
+        </w:rPr>
+      </w:pPr>
+      <w:r>
+        <w:rPr>
+          <w:b w:val="0"/>
+          <w:i w:val="0"/>
+          <w:sz w:val="24"/>
+        </w:rPr>
+        <w:t>The residual leakage risk is that the cited papers, being older than the citing paper by construction, are plausibly inside every evaluated model's training data. That cannot be avoided for this task and it does not give a model access to the target text, which is what is scored; it is recorded here rather than dismissed.</w:t>
       </w:r>
     </w:p>
     <w:p>
@@ -8008,7 +9345,7 @@
       </w:pPr>
     </w:p>
     <w:p>
-      <w:bookmarkStart w:id="1022" w:name="_toc_5_conclusion_and_future_scope"/>
+      <w:bookmarkStart w:id="1026" w:name="_toc_5_conclusion_and_future_scope"/>
       <w:pPr>
         <w:pageBreakBefore/>
         <w:spacing w:line="300" w:lineRule="auto"/>
@@ -8037,7 +9374,7 @@
         <w:lastRenderedPageBreak/>
         <w:t>CHAPTER 5</w:t>
       </w:r>
-      <w:bookmarkEnd w:id="1022"/>
+      <w:bookmarkEnd w:id="1026"/>
     </w:p>
     <w:p>
       <w:pPr>
@@ -8097,7 +9434,7 @@
       </w:pPr>
     </w:p>
     <w:p>
-      <w:bookmarkStart w:id="1023" w:name="_toc_5_1_conclusion"/>
+      <w:bookmarkStart w:id="1027" w:name="_toc_5_1_conclusion"/>
       <w:pPr>
         <w:spacing w:line="300" w:lineRule="auto"/>
         <w:jc w:val="both"/>
@@ -8123,7 +9460,7 @@
         </w:rPr>
         <w:t>Conclusion</w:t>
       </w:r>
-      <w:bookmarkEnd w:id="1023"/>
+      <w:bookmarkEnd w:id="1027"/>
     </w:p>
     <w:p>
       <w:pPr>
@@ -8206,7 +9543,7 @@
       </w:r>
     </w:p>
     <w:p>
-      <w:bookmarkStart w:id="1024" w:name="_toc_5_2_suggestions_for_future_directions"/>
+      <w:bookmarkStart w:id="1028" w:name="_toc_5_2_suggestions_for_future_directions"/>
       <w:pPr>
         <w:spacing w:line="300" w:lineRule="auto"/>
         <w:jc w:val="both"/>
@@ -8224,7 +9561,7 @@
         </w:rPr>
         <w:t>5.2 Suggestions for future directions</w:t>
       </w:r>
-      <w:bookmarkEnd w:id="1024"/>
+      <w:bookmarkEnd w:id="1028"/>
     </w:p>
     <w:p>
       <w:pPr>
@@ -8440,7 +9777,7 @@
       </w:pPr>
     </w:p>
     <w:p>
-      <w:bookmarkStart w:id="1025" w:name="_toc_references"/>
+      <w:bookmarkStart w:id="1029" w:name="_toc_references"/>
       <w:pPr>
         <w:pageBreakBefore/>
         <w:spacing w:line="300" w:lineRule="auto"/>
@@ -8470,7 +9807,7 @@
         </w:rPr>
         <w:t xml:space="preserve"> </w:t>
       </w:r>
-      <w:bookmarkEnd w:id="1025"/>
+      <w:bookmarkEnd w:id="1029"/>
     </w:p>
     <w:p>
       <w:pPr>

</xml_diff>

<commit_message>
Render variable subscripts properly in the report prose
The equations are typeset images, but the variables are also named in the
surrounding sentences, where "n_c" and "tau_sup" read as typos. Prose now carries
subscript markers that become real subscript runs in the document.
</commit_message>
<xml_diff>
--- a/report/LitReview_Report.docx
+++ b/report/LitReview_Report.docx
@@ -5703,7 +5703,23 @@
           <w:i w:val="0"/>
           <w:sz w:val="24"/>
         </w:rPr>
-        <w:t>where N is the number of training rows, K the number of classes and n_c the count of class c, so that the rare relations are learnable at all. Performance is reported as macro-F1 over the classes present in the gold set,</w:t>
+        <w:t>where N is the number of training rows, K the number of classes and n</w:t>
+      </w:r>
+      <w:r>
+        <w:rPr>
+          <w:i w:val="0"/>
+          <w:sz w:val="24"/>
+          <w:vertAlign w:val="subscript"/>
+        </w:rPr>
+        <w:t>c</w:t>
+      </w:r>
+      <w:r>
+        <w:rPr>
+          <w:b w:val="0"/>
+          <w:i w:val="0"/>
+          <w:sz w:val="24"/>
+        </w:rPr>
+        <w:t xml:space="preserve"> the count of class c, so that the rare relations are learnable at all. Performance is reported as macro-F1 over the classes present in the gold set,</w:t>
       </w:r>
     </w:p>
     <w:p>
@@ -5771,7 +5787,39 @@
           <w:i w:val="0"/>
           <w:sz w:val="24"/>
         </w:rPr>
-        <w:t>with P_c and R_c the precision and recall of class c, because accuracy on this distribution is dominated by background and would hide exactly the classes the downstream stages need. Agreement between the LLM labeller and the human gold set is reported as Cohen's κ,</w:t>
+        <w:t>with P</w:t>
+      </w:r>
+      <w:r>
+        <w:rPr>
+          <w:i w:val="0"/>
+          <w:sz w:val="24"/>
+          <w:vertAlign w:val="subscript"/>
+        </w:rPr>
+        <w:t>c</w:t>
+      </w:r>
+      <w:r>
+        <w:rPr>
+          <w:b w:val="0"/>
+          <w:i w:val="0"/>
+          <w:sz w:val="24"/>
+        </w:rPr>
+        <w:t xml:space="preserve"> and R</w:t>
+      </w:r>
+      <w:r>
+        <w:rPr>
+          <w:i w:val="0"/>
+          <w:sz w:val="24"/>
+          <w:vertAlign w:val="subscript"/>
+        </w:rPr>
+        <w:t>c</w:t>
+      </w:r>
+      <w:r>
+        <w:rPr>
+          <w:b w:val="0"/>
+          <w:i w:val="0"/>
+          <w:sz w:val="24"/>
+        </w:rPr>
+        <w:t xml:space="preserve"> the precision and recall of class c, because accuracy on this distribution is dominated by background and would hide exactly the classes the downstream stages need. Agreement between the LLM labeller and the human gold set is reported as Cohen's κ,</w:t>
       </w:r>
     </w:p>
     <w:p>
@@ -5839,7 +5887,39 @@
           <w:i w:val="0"/>
           <w:sz w:val="24"/>
         </w:rPr>
-        <w:t>where p_o is the observed agreement and p_e the agreement expected from the two label distributions independently, so that a labeller that simply predicts the majority class scores near zero rather than near its accuracy.</w:t>
+        <w:t>where p</w:t>
+      </w:r>
+      <w:r>
+        <w:rPr>
+          <w:i w:val="0"/>
+          <w:sz w:val="24"/>
+          <w:vertAlign w:val="subscript"/>
+        </w:rPr>
+        <w:t>o</w:t>
+      </w:r>
+      <w:r>
+        <w:rPr>
+          <w:b w:val="0"/>
+          <w:i w:val="0"/>
+          <w:sz w:val="24"/>
+        </w:rPr>
+        <w:t xml:space="preserve"> is the observed agreement and p</w:t>
+      </w:r>
+      <w:r>
+        <w:rPr>
+          <w:i w:val="0"/>
+          <w:sz w:val="24"/>
+          <w:vertAlign w:val="subscript"/>
+        </w:rPr>
+        <w:t>e</w:t>
+      </w:r>
+      <w:r>
+        <w:rPr>
+          <w:b w:val="0"/>
+          <w:i w:val="0"/>
+          <w:sz w:val="24"/>
+        </w:rPr>
+        <w:t xml:space="preserve"> the agreement expected from the two label distributions independently, so that a labeller that simply predicts the majority class scores near zero rather than near its accuracy.</w:t>
       </w:r>
     </w:p>
     <w:p>
@@ -6011,7 +6091,23 @@
           <w:i w:val="0"/>
           <w:sz w:val="24"/>
         </w:rPr>
-        <w:t>where E(s) is the set of evidence passages behind sentence s and τ_sup is the fitted upper threshold. A sentence that cites nothing has an empty evidence set and is unsupported by construction, which is the intended behaviour for a review that claims to be grounded. Sentences the Verifier rejects go back to the Writer once; if the revision does not improve the score the draft is kept and the offending sentences are flagged in the output rather than silently removed.</w:t>
+        <w:t>where E(s) is the set of evidence passages behind sentence s and τ</w:t>
+      </w:r>
+      <w:r>
+        <w:rPr>
+          <w:i w:val="0"/>
+          <w:sz w:val="24"/>
+          <w:vertAlign w:val="subscript"/>
+        </w:rPr>
+        <w:t>sup</w:t>
+      </w:r>
+      <w:r>
+        <w:rPr>
+          <w:b w:val="0"/>
+          <w:i w:val="0"/>
+          <w:sz w:val="24"/>
+        </w:rPr>
+        <w:t xml:space="preserve"> is the fitted upper threshold. A sentence that cites nothing has an empty evidence set and is unsupported by construction, which is the intended behaviour for a review that claims to be grounded. Sentences the Verifier rejects go back to the Writer once; if the revision does not improve the score the draft is kept and the offending sentences are flagged in the output rather than silently removed.</w:t>
       </w:r>
     </w:p>
     <w:p>

</xml_diff>

<commit_message>
Say plainly who produced the gold labels
The report called the evaluation set a "human gold set". It is not: those labels
are assigned by the AI assistant that built the pipeline, working blind to the
labeller's output from the written guide, and then reviewed by the author.
Calling that a human annotation overstates it, and the agreement figures in
Chapter 4 rest on it.

It is now an "adjudicated gold set" throughout, Section 4.2 states the provenance
where the number appears, and the limitation is specific: a systematic misreading
of the labelling guide would move the labeller and the gold set the same way, so
the two are not fully independent.
</commit_message>
<xml_diff>
--- a/report/LitReview_Report.docx
+++ b/report/LitReview_Report.docx
@@ -3423,7 +3423,7 @@
           <w:i w:val="0"/>
           <w:sz w:val="24"/>
         </w:rPr>
-        <w:t>2. Define a seven-class citation-relation taxonomy with a written labelling guide, label contexts with an LLM, and quantify how far those labels can be trusted by measuring accuracy and Cohen's κ against an independently hand-labelled gold set.</w:t>
+        <w:t>2. Define a seven-class citation-relation taxonomy with a written labelling guide, label contexts with an LLM, and quantify how far those labels can be trusted by measuring accuracy and Cohen's κ against an independently adjudicated gold set.</w:t>
       </w:r>
     </w:p>
     <w:p>
@@ -5819,7 +5819,7 @@
           <w:i w:val="0"/>
           <w:sz w:val="24"/>
         </w:rPr>
-        <w:t xml:space="preserve"> the precision and recall of class c, because accuracy on this distribution is dominated by background and would hide exactly the classes the downstream stages need. Agreement between the LLM labeller and the human gold set is reported as Cohen's κ,</w:t>
+        <w:t xml:space="preserve"> the precision and recall of class c, because accuracy on this distribution is dominated by background and would hide exactly the classes the downstream stages need. Agreement between the LLM labeller and the adjudicated gold set is reported as Cohen's κ,</w:t>
       </w:r>
     </w:p>
     <w:p>
@@ -6534,7 +6534,7 @@
           <w:i w:val="0"/>
           <w:sz w:val="24"/>
         </w:rPr>
-        <w:t>Leakage is controlled by the submission window. Training papers come from 2023-2024 and test papers from a window that begins after the knowledge cutoff of every model evaluated. The Verifier's thresholds, the classifier's dev split and the human gold set all come from the training split, so nothing is tuned on the benchmark. The dates and the residual risks — chiefly that the cited papers are necessarily old and so plausibly inside every model's training data, even though the target text is not — are recorded in docs/leakage.md and in Section 4.1.</w:t>
+        <w:t>Leakage is controlled by the submission window. Training papers come from 2023-2024 and test papers from a window that begins after the knowledge cutoff of every model evaluated. The Verifier's thresholds, the classifier's dev split and the adjudicated gold set all come from the training split, so nothing is tuned on the benchmark. The dates and the residual risks — chiefly that the cited papers are necessarily old and so plausibly inside every model's training data, even though the target text is not — are recorded in docs/leakage.md and in Section 4.1.</w:t>
       </w:r>
     </w:p>
     <w:p>
@@ -9232,7 +9232,7 @@
           <w:i w:val="0"/>
           <w:sz w:val="24"/>
         </w:rPr>
-        <w:t>• LLM-labelled training data. The relation classifier is trained on labels produced by a language model, not by humans. Section 4.2 quantifies how far those labels can be trusted against a hand-labelled gold set, and the classifier cannot be better than its teacher on classes where the teacher is weak. The gold set itself is stratified rather than random, which makes the agreement figure pessimistic but also means it does not estimate accuracy on arbitrary text.</w:t>
+        <w:t>• LLM-labelled training data. The relation classifier is trained on labels produced by a language model, not by humans. Section 4.2 quantifies how far those labels can be trusted against a adjudicated gold set, and the classifier cannot be better than its teacher on classes where the teacher is weak. The gold set itself is stratified rather than random, which makes the agreement figure pessimistic but also means it does not estimate accuracy on arbitrary text.</w:t>
       </w:r>
     </w:p>
     <w:p>
@@ -9253,7 +9253,7 @@
           <w:i w:val="0"/>
           <w:sz w:val="24"/>
         </w:rPr>
-        <w:t>• Single annotator. The gold labels, the Verifier's dev set and the contradiction and gap spot checks were each produced by one annotator, so no inter-annotator agreement can be computed and systematic bias in the labelling guide would not show up.</w:t>
+        <w:t>• Who produced the gold labels. The gold set, the Verifier's dev set and the contradiction and gap spot checks were labelled by the AI assistant that built the pipeline, blind to the labeller's own output and following the written guide, then reviewed by the author. That is an independent second opinion rather than expert human annotation: a systematic misreading of the labelling guide would affect both the labeller and the gold set in the same direction, and with a single annotator no inter-annotator agreement can be computed. Every agreement figure in Section 4.2 should be read with this in mind, and replacing these labels with independently sourced human ones is the first item in Section 5.2.</w:t>
       </w:r>
     </w:p>
     <w:p>

</xml_diff>

<commit_message>
Cut the report to 27 pages by dropping redundant figures
Removed the two console screenshots from Chapter 3 as asked, and with them two
figures that only restated a table: the dataset histograms, which the dataset
statistics table already gives, and the tokens-per-stage chart, which the cost
table covers. Chapter 3's console section is now one paragraph pointing at the
screenshot that does carry its weight, in Section 4.7.

Also condensed Chapter 2's survey sections and Chapter 4's resolution
narrative, and compressed the three contents tables.

16 captions, all referenced; numbering contiguous; 24 results lookups satisfied.
</commit_message>
<xml_diff>
--- a/report/LitReview_Report.docx
+++ b/report/LitReview_Report.docx
@@ -707,7 +707,7 @@
             <w:r>
               <w:rPr>
                 <w:b/>
-                <w:sz w:val="24"/>
+                <w:sz w:val="22"/>
               </w:rPr>
               <w:t>Table of Contents</w:t>
             </w:r>
@@ -782,7 +782,7 @@
             <w:r>
               <w:rPr>
                 <w:b/>
-                <w:sz w:val="19"/>
+                <w:sz w:val="17"/>
               </w:rPr>
               <w:t>Abstract</w:t>
             </w:r>
@@ -845,7 +845,7 @@
             <w:r>
               <w:rPr>
                 <w:b/>
-                <w:sz w:val="19"/>
+                <w:sz w:val="17"/>
               </w:rPr>
               <w:t>List of Tables</w:t>
             </w:r>
@@ -908,7 +908,7 @@
             <w:r>
               <w:rPr>
                 <w:b/>
-                <w:sz w:val="19"/>
+                <w:sz w:val="17"/>
               </w:rPr>
               <w:t>List of Figures</w:t>
             </w:r>
@@ -971,7 +971,7 @@
             <w:r>
               <w:rPr>
                 <w:b/>
-                <w:sz w:val="19"/>
+                <w:sz w:val="17"/>
               </w:rPr>
               <w:t>Chapter 1</w:t>
             </w:r>
@@ -1001,7 +1001,7 @@
             <w:r>
               <w:rPr>
                 <w:b/>
-                <w:sz w:val="19"/>
+                <w:sz w:val="17"/>
               </w:rPr>
               <w:t>INTRODUCTION</w:t>
             </w:r>
@@ -1052,7 +1052,7 @@
             <w:r>
               <w:rPr>
                 <w:b w:val="0"/>
-                <w:sz w:val="19"/>
+                <w:sz w:val="17"/>
               </w:rPr>
               <w:t>1.1</w:t>
             </w:r>
@@ -1071,7 +1071,7 @@
             <w:r>
               <w:rPr>
                 <w:b w:val="0"/>
-                <w:sz w:val="19"/>
+                <w:sz w:val="17"/>
               </w:rPr>
               <w:t>Overview of the project work</w:t>
             </w:r>
@@ -1122,7 +1122,7 @@
             <w:r>
               <w:rPr>
                 <w:b w:val="0"/>
-                <w:sz w:val="19"/>
+                <w:sz w:val="17"/>
               </w:rPr>
               <w:t>1.2</w:t>
             </w:r>
@@ -1141,7 +1141,7 @@
             <w:r>
               <w:rPr>
                 <w:b w:val="0"/>
-                <w:sz w:val="19"/>
+                <w:sz w:val="17"/>
               </w:rPr>
               <w:t>Motivation and background of the study</w:t>
             </w:r>
@@ -1192,7 +1192,7 @@
             <w:r>
               <w:rPr>
                 <w:b w:val="0"/>
-                <w:sz w:val="19"/>
+                <w:sz w:val="17"/>
               </w:rPr>
               <w:t>1.3</w:t>
             </w:r>
@@ -1211,7 +1211,7 @@
             <w:r>
               <w:rPr>
                 <w:b w:val="0"/>
-                <w:sz w:val="19"/>
+                <w:sz w:val="17"/>
               </w:rPr>
               <w:t>Problem statement and relevance</w:t>
             </w:r>
@@ -1262,7 +1262,7 @@
             <w:r>
               <w:rPr>
                 <w:b w:val="0"/>
-                <w:sz w:val="19"/>
+                <w:sz w:val="17"/>
               </w:rPr>
               <w:t>1.4</w:t>
             </w:r>
@@ -1281,7 +1281,7 @@
             <w:r>
               <w:rPr>
                 <w:b w:val="0"/>
-                <w:sz w:val="19"/>
+                <w:sz w:val="17"/>
               </w:rPr>
               <w:t>Objectives</w:t>
             </w:r>
@@ -1321,7 +1321,7 @@
             <w:r>
               <w:rPr>
                 <w:b/>
-                <w:sz w:val="19"/>
+                <w:sz w:val="17"/>
               </w:rPr>
               <w:t>Chapter 2</w:t>
             </w:r>
@@ -1351,7 +1351,7 @@
             <w:r>
               <w:rPr>
                 <w:b/>
-                <w:sz w:val="19"/>
+                <w:sz w:val="17"/>
               </w:rPr>
               <w:t>BACKGROUND THEORY / LITERATURE REVIEW</w:t>
             </w:r>
@@ -1402,7 +1402,7 @@
             <w:r>
               <w:rPr>
                 <w:b w:val="0"/>
-                <w:sz w:val="19"/>
+                <w:sz w:val="17"/>
               </w:rPr>
               <w:t>2.1</w:t>
             </w:r>
@@ -1421,7 +1421,7 @@
             <w:r>
               <w:rPr>
                 <w:b w:val="0"/>
-                <w:sz w:val="19"/>
+                <w:sz w:val="17"/>
               </w:rPr>
               <w:t>Summary of existing studies / Comparative analysis of various approaches</w:t>
             </w:r>
@@ -1472,7 +1472,7 @@
             <w:r>
               <w:rPr>
                 <w:b w:val="0"/>
-                <w:sz w:val="19"/>
+                <w:sz w:val="17"/>
               </w:rPr>
               <w:t>2.2</w:t>
             </w:r>
@@ -1491,7 +1491,7 @@
             <w:r>
               <w:rPr>
                 <w:b w:val="0"/>
-                <w:sz w:val="19"/>
+                <w:sz w:val="17"/>
               </w:rPr>
               <w:t>Key findings, trends, and research gaps</w:t>
             </w:r>
@@ -1542,7 +1542,7 @@
             <w:r>
               <w:rPr>
                 <w:b w:val="0"/>
-                <w:sz w:val="19"/>
+                <w:sz w:val="17"/>
               </w:rPr>
               <w:t>2.4</w:t>
             </w:r>
@@ -1561,7 +1561,7 @@
             <w:r>
               <w:rPr>
                 <w:b w:val="0"/>
-                <w:sz w:val="19"/>
+                <w:sz w:val="17"/>
               </w:rPr>
               <w:t>Conclusion</w:t>
             </w:r>
@@ -1601,7 +1601,7 @@
             <w:r>
               <w:rPr>
                 <w:b/>
-                <w:sz w:val="19"/>
+                <w:sz w:val="17"/>
               </w:rPr>
               <w:t>Chapter 3</w:t>
             </w:r>
@@ -1631,7 +1631,7 @@
             <w:r>
               <w:rPr>
                 <w:b/>
-                <w:sz w:val="19"/>
+                <w:sz w:val="17"/>
               </w:rPr>
               <w:t>METHODOLOGY</w:t>
             </w:r>
@@ -1682,7 +1682,7 @@
             <w:r>
               <w:rPr>
                 <w:b w:val="0"/>
-                <w:sz w:val="19"/>
+                <w:sz w:val="17"/>
               </w:rPr>
               <w:t>3.1</w:t>
             </w:r>
@@ -1701,7 +1701,7 @@
             <w:r>
               <w:rPr>
                 <w:b w:val="0"/>
-                <w:sz w:val="19"/>
+                <w:sz w:val="17"/>
               </w:rPr>
               <w:t>Methodology with diagrams</w:t>
             </w:r>
@@ -1752,7 +1752,7 @@
             <w:r>
               <w:rPr>
                 <w:b w:val="0"/>
-                <w:sz w:val="19"/>
+                <w:sz w:val="17"/>
               </w:rPr>
               <w:t>3.2</w:t>
             </w:r>
@@ -1771,7 +1771,7 @@
             <w:r>
               <w:rPr>
                 <w:b w:val="0"/>
-                <w:sz w:val="19"/>
+                <w:sz w:val="17"/>
               </w:rPr>
               <w:t>System requirements</w:t>
             </w:r>
@@ -1811,7 +1811,7 @@
             <w:r>
               <w:rPr>
                 <w:b/>
-                <w:sz w:val="19"/>
+                <w:sz w:val="17"/>
               </w:rPr>
               <w:t>Chapter 4</w:t>
             </w:r>
@@ -1841,7 +1841,7 @@
             <w:r>
               <w:rPr>
                 <w:b/>
-                <w:sz w:val="19"/>
+                <w:sz w:val="17"/>
               </w:rPr>
               <w:t>ANALYSIS AND DISCUSSION</w:t>
             </w:r>
@@ -1881,7 +1881,7 @@
             <w:r>
               <w:rPr>
                 <w:b/>
-                <w:sz w:val="19"/>
+                <w:sz w:val="17"/>
               </w:rPr>
               <w:t>Chapter 5</w:t>
             </w:r>
@@ -1911,7 +1911,7 @@
             <w:r>
               <w:rPr>
                 <w:b/>
-                <w:sz w:val="19"/>
+                <w:sz w:val="17"/>
               </w:rPr>
               <w:t>CONCLUSION AND FUTURE SCOPE</w:t>
             </w:r>
@@ -1962,7 +1962,7 @@
             <w:r>
               <w:rPr>
                 <w:b w:val="0"/>
-                <w:sz w:val="19"/>
+                <w:sz w:val="17"/>
               </w:rPr>
               <w:t>5.1</w:t>
             </w:r>
@@ -1981,7 +1981,7 @@
             <w:r>
               <w:rPr>
                 <w:b w:val="0"/>
-                <w:sz w:val="19"/>
+                <w:sz w:val="17"/>
               </w:rPr>
               <w:t>Conclusion</w:t>
             </w:r>
@@ -2032,7 +2032,7 @@
             <w:r>
               <w:rPr>
                 <w:b w:val="0"/>
-                <w:sz w:val="19"/>
+                <w:sz w:val="17"/>
               </w:rPr>
               <w:t>5.2</w:t>
             </w:r>
@@ -2051,7 +2051,7 @@
             <w:r>
               <w:rPr>
                 <w:b w:val="0"/>
-                <w:sz w:val="19"/>
+                <w:sz w:val="17"/>
               </w:rPr>
               <w:t>Suggestions for future directions</w:t>
             </w:r>
@@ -2091,7 +2091,7 @@
             <w:r>
               <w:rPr>
                 <w:b/>
-                <w:sz w:val="19"/>
+                <w:sz w:val="17"/>
               </w:rPr>
               <w:t>References</w:t>
             </w:r>
@@ -2143,9 +2143,7 @@
       </w:tr>
     </w:tbl>
     <w:p>
-      <w:bookmarkStart w:id="1002" w:name="_toc_list_of_tables"/>
-      <w:pPr>
-        <w:pageBreakBefore/>
+      <w:pPr>
         <w:spacing w:line="300" w:lineRule="auto"/>
         <w:jc w:val="center"/>
         <w:rPr>
@@ -2154,12 +2152,35 @@
           <w:sz w:val="32"/>
           <w:szCs w:val="24"/>
         </w:rPr>
-      </w:pPr>
-      <w:r>
+        <w:sectPr>
+          <w:footerReference w:type="default" r:id="rId13"/>
+          <w:pgSz w:w="11909" w:h="16834" w:code="9"/>
+          <w:pgMar w:top="1440" w:right="1440" w:bottom="1276" w:left="1440" w:header="720" w:footer="720" w:gutter="0"/>
+          <w:pgNumType w:fmt="lowerRoman" w:start="1"/>
+          <w:cols w:space="720"/>
+          <w:noEndnote/>
+          <w:docGrid w:linePitch="272"/>
+        </w:sectPr>
+      </w:pPr>
+    </w:p>
+    <w:p>
+      <w:bookmarkStart w:id="1002" w:name="_toc_list_of_tables"/>
+      <w:pPr>
+        <w:pageBreakBefore w:val="0"/>
+        <w:spacing w:line="300" w:lineRule="auto" w:before="120" w:after="40"/>
+        <w:jc w:val="center"/>
         <w:rPr>
           <w:b/>
           <w:bCs/>
           <w:sz w:val="32"/>
+          <w:szCs w:val="24"/>
+        </w:rPr>
+      </w:pPr>
+      <w:r>
+        <w:rPr>
+          <w:b/>
+          <w:bCs/>
+          <w:sz w:val="22"/>
           <w:szCs w:val="24"/>
         </w:rPr>
         <w:lastRenderedPageBreak/>
@@ -2211,7 +2232,7 @@
             <w:r>
               <w:rPr>
                 <w:b/>
-                <w:sz w:val="20"/>
+                <w:sz w:val="17"/>
               </w:rPr>
               <w:t>Table No</w:t>
             </w:r>
@@ -2229,7 +2250,7 @@
             <w:r>
               <w:rPr>
                 <w:b/>
-                <w:sz w:val="20"/>
+                <w:sz w:val="17"/>
               </w:rPr>
               <w:t>Table Title</w:t>
             </w:r>
@@ -2248,7 +2269,7 @@
             <w:r>
               <w:rPr>
                 <w:b/>
-                <w:sz w:val="20"/>
+                <w:sz w:val="17"/>
               </w:rPr>
               <w:t>Page No</w:t>
             </w:r>
@@ -2268,7 +2289,7 @@
             <w:r>
               <w:rPr>
                 <w:b w:val="0"/>
-                <w:sz w:val="19"/>
+                <w:sz w:val="17"/>
               </w:rPr>
               <w:t>Table 1</w:t>
             </w:r>
@@ -2286,7 +2307,7 @@
             <w:r>
               <w:rPr>
                 <w:b w:val="0"/>
-                <w:sz w:val="19"/>
+                <w:sz w:val="17"/>
               </w:rPr>
               <w:t>How different approaches compare</w:t>
             </w:r>
@@ -2326,7 +2347,7 @@
             <w:r>
               <w:rPr>
                 <w:b w:val="0"/>
-                <w:sz w:val="19"/>
+                <w:sz w:val="17"/>
               </w:rPr>
               <w:t>Table 2</w:t>
             </w:r>
@@ -2344,7 +2365,7 @@
             <w:r>
               <w:rPr>
                 <w:b w:val="0"/>
-                <w:sz w:val="19"/>
+                <w:sz w:val="17"/>
               </w:rPr>
               <w:t>What the system was run on, and the exact versions used for the results in Chapter 4</w:t>
             </w:r>
@@ -2384,7 +2405,7 @@
             <w:r>
               <w:rPr>
                 <w:b w:val="0"/>
-                <w:sz w:val="19"/>
+                <w:sz w:val="17"/>
               </w:rPr>
               <w:t>Table 3</w:t>
             </w:r>
@@ -2402,7 +2423,7 @@
             <w:r>
               <w:rPr>
                 <w:b w:val="0"/>
-                <w:sz w:val="19"/>
+                <w:sz w:val="17"/>
               </w:rPr>
               <w:t>Stage 1 mining yield at pilot scale</w:t>
             </w:r>
@@ -2442,7 +2463,7 @@
             <w:r>
               <w:rPr>
                 <w:b w:val="0"/>
-                <w:sz w:val="19"/>
+                <w:sz w:val="17"/>
               </w:rPr>
               <w:t>Table 4</w:t>
             </w:r>
@@ -2460,7 +2481,7 @@
             <w:r>
               <w:rPr>
                 <w:b w:val="0"/>
-                <w:sz w:val="19"/>
+                <w:sz w:val="17"/>
               </w:rPr>
               <w:t>Dataset statistics for the mined arXiv benchmark and the external Multi-XScience benchmark</w:t>
             </w:r>
@@ -2500,7 +2521,7 @@
             <w:r>
               <w:rPr>
                 <w:b w:val="0"/>
-                <w:sz w:val="19"/>
+                <w:sz w:val="17"/>
               </w:rPr>
               <w:t>Table 5</w:t>
             </w:r>
@@ -2518,7 +2539,7 @@
             <w:r>
               <w:rPr>
                 <w:b w:val="0"/>
-                <w:sz w:val="19"/>
+                <w:sz w:val="17"/>
               </w:rPr>
               <w:t>Citation-relation classification on the 200-context adjudicated gold set</w:t>
             </w:r>
@@ -2558,7 +2579,7 @@
             <w:r>
               <w:rPr>
                 <w:b w:val="0"/>
-                <w:sz w:val="19"/>
+                <w:sz w:val="17"/>
               </w:rPr>
               <w:t>Table 6</w:t>
             </w:r>
@@ -2576,7 +2597,7 @@
             <w:r>
               <w:rPr>
                 <w:b w:val="0"/>
-                <w:sz w:val="19"/>
+                <w:sz w:val="17"/>
               </w:rPr>
               <w:t>Failure categories counted over every cached generation in the evaluation run</w:t>
             </w:r>
@@ -2607,7 +2628,8 @@
     <w:p>
       <w:bookmarkStart w:id="1003" w:name="_toc_list_of_figures"/>
       <w:pPr>
-        <w:spacing w:line="300" w:lineRule="auto"/>
+        <w:pageBreakBefore w:val="0"/>
+        <w:spacing w:line="300" w:lineRule="auto" w:before="120" w:after="40"/>
         <w:jc w:val="center"/>
         <w:rPr>
           <w:sz w:val="24"/>
@@ -2618,7 +2640,7 @@
         <w:rPr>
           <w:b/>
           <w:bCs/>
-          <w:sz w:val="32"/>
+          <w:sz w:val="22"/>
           <w:szCs w:val="24"/>
         </w:rPr>
         <w:lastRenderedPageBreak/>
@@ -2626,7 +2648,7 @@
       </w:r>
       <w:r>
         <w:rPr>
-          <w:sz w:val="24"/>
+          <w:sz w:val="22"/>
           <w:szCs w:val="24"/>
         </w:rPr>
         <w:t xml:space="preserve"> </w:t>
@@ -2684,7 +2706,7 @@
             <w:r>
               <w:rPr>
                 <w:b/>
-                <w:sz w:val="20"/>
+                <w:sz w:val="17"/>
               </w:rPr>
               <w:t>Figure No</w:t>
             </w:r>
@@ -2702,7 +2724,7 @@
             <w:r>
               <w:rPr>
                 <w:b/>
-                <w:sz w:val="20"/>
+                <w:sz w:val="17"/>
               </w:rPr>
               <w:t>Figure Title</w:t>
             </w:r>
@@ -2721,7 +2743,7 @@
             <w:r>
               <w:rPr>
                 <w:b/>
-                <w:sz w:val="20"/>
+                <w:sz w:val="17"/>
               </w:rPr>
               <w:t>Page No</w:t>
             </w:r>
@@ -2741,7 +2763,7 @@
             <w:r>
               <w:rPr>
                 <w:b w:val="0"/>
-                <w:sz w:val="19"/>
+                <w:sz w:val="17"/>
               </w:rPr>
               <w:t>Figure 1</w:t>
             </w:r>
@@ -2759,7 +2781,7 @@
             <w:r>
               <w:rPr>
                 <w:b w:val="0"/>
-                <w:sz w:val="19"/>
+                <w:sz w:val="17"/>
               </w:rPr>
               <w:t>How the system fits together</w:t>
             </w:r>
@@ -2799,7 +2821,7 @@
             <w:r>
               <w:rPr>
                 <w:b w:val="0"/>
-                <w:sz w:val="19"/>
+                <w:sz w:val="17"/>
               </w:rPr>
               <w:t>Figure 2</w:t>
             </w:r>
@@ -2817,7 +2839,7 @@
             <w:r>
               <w:rPr>
                 <w:b w:val="0"/>
-                <w:sz w:val="19"/>
+                <w:sz w:val="17"/>
               </w:rPr>
               <w:t>Mining papers from arXiv</w:t>
             </w:r>
@@ -2857,7 +2879,7 @@
             <w:r>
               <w:rPr>
                 <w:b w:val="0"/>
-                <w:sz w:val="19"/>
+                <w:sz w:val="17"/>
               </w:rPr>
               <w:t>Figure 3</w:t>
             </w:r>
@@ -2875,7 +2897,7 @@
             <w:r>
               <w:rPr>
                 <w:b w:val="0"/>
-                <w:sz w:val="19"/>
+                <w:sz w:val="17"/>
               </w:rPr>
               <w:t>The ten steps, the point where a human approves the paper list, and the single rewrite loop</w:t>
             </w:r>
@@ -2915,7 +2937,7 @@
             <w:r>
               <w:rPr>
                 <w:b w:val="0"/>
-                <w:sz w:val="19"/>
+                <w:sz w:val="17"/>
               </w:rPr>
               <w:t>Figure 4</w:t>
             </w:r>
@@ -2933,9 +2955,9 @@
             <w:r>
               <w:rPr>
                 <w:b w:val="0"/>
-                <w:sz w:val="19"/>
-              </w:rPr>
-              <w:t>The console's overview</w:t>
+                <w:sz w:val="17"/>
+              </w:rPr>
+              <w:t>Mining yield: papers surviving each step, as counts and as a percentage of the submissions listed</w:t>
             </w:r>
           </w:p>
         </w:tc>
@@ -2973,7 +2995,7 @@
             <w:r>
               <w:rPr>
                 <w:b w:val="0"/>
-                <w:sz w:val="19"/>
+                <w:sz w:val="17"/>
               </w:rPr>
               <w:t>Figure 5</w:t>
             </w:r>
@@ -2991,9 +3013,9 @@
             <w:r>
               <w:rPr>
                 <w:b w:val="0"/>
-                <w:sz w:val="19"/>
-              </w:rPr>
-              <w:t>A test example in the console: the section the author wrote, above the cited papers' abstracts that are the only input…</w:t>
+                <w:sz w:val="17"/>
+              </w:rPr>
+              <w:t>Distribution of LLM-assigned citation relations over the labelled pool</w:t>
             </w:r>
           </w:p>
         </w:tc>
@@ -3031,7 +3053,7 @@
             <w:r>
               <w:rPr>
                 <w:b w:val="0"/>
-                <w:sz w:val="19"/>
+                <w:sz w:val="17"/>
               </w:rPr>
               <w:t>Figure 6</w:t>
             </w:r>
@@ -3049,9 +3071,9 @@
             <w:r>
               <w:rPr>
                 <w:b w:val="0"/>
-                <w:sz w:val="19"/>
-              </w:rPr>
-              <w:t>Mining yield: papers surviving each step, as counts and as a percentage of the submissions listed</w:t>
+                <w:sz w:val="17"/>
+              </w:rPr>
+              <w:t>Confusion matrices on the adjudicated gold set, for the LLM labeller and for the fine-tuned classifier</w:t>
             </w:r>
           </w:p>
         </w:tc>
@@ -3089,7 +3111,7 @@
             <w:r>
               <w:rPr>
                 <w:b w:val="0"/>
-                <w:sz w:val="19"/>
+                <w:sz w:val="17"/>
               </w:rPr>
               <w:t>Figure 7</w:t>
             </w:r>
@@ -3107,9 +3129,9 @@
             <w:r>
               <w:rPr>
                 <w:b w:val="0"/>
-                <w:sz w:val="19"/>
-              </w:rPr>
-              <w:t>Distribution of related-work length, number of cited papers and abstract coverage across the mined benchmark examples</w:t>
+                <w:sz w:val="17"/>
+              </w:rPr>
+              <w:t>Accuracy and macro-F1 of each relation-classification system on the adjudicated gold set</w:t>
             </w:r>
           </w:p>
         </w:tc>
@@ -3147,7 +3169,7 @@
             <w:r>
               <w:rPr>
                 <w:b w:val="0"/>
-                <w:sz w:val="19"/>
+                <w:sz w:val="17"/>
               </w:rPr>
               <w:t>Figure 8</w:t>
             </w:r>
@@ -3165,9 +3187,9 @@
             <w:r>
               <w:rPr>
                 <w:b w:val="0"/>
-                <w:sz w:val="19"/>
-              </w:rPr>
-              <w:t>Distribution of LLM-assigned citation relations over the labelled pool</w:t>
+                <w:sz w:val="17"/>
+              </w:rPr>
+              <w:t>Verifier calibration</w:t>
             </w:r>
           </w:p>
         </w:tc>
@@ -3205,7 +3227,7 @@
             <w:r>
               <w:rPr>
                 <w:b w:val="0"/>
-                <w:sz w:val="19"/>
+                <w:sz w:val="17"/>
               </w:rPr>
               <w:t>Figure 9</w:t>
             </w:r>
@@ -3223,9 +3245,9 @@
             <w:r>
               <w:rPr>
                 <w:b w:val="0"/>
-                <w:sz w:val="19"/>
-              </w:rPr>
-              <w:t>Confusion matrices on the adjudicated gold set, for the LLM labeller and for the fine-tuned classifier</w:t>
+                <w:sz w:val="17"/>
+              </w:rPr>
+              <w:t>Verifier verdicts over extracted claims, by extraction run</w:t>
             </w:r>
           </w:p>
         </w:tc>
@@ -3263,7 +3285,7 @@
             <w:r>
               <w:rPr>
                 <w:b w:val="0"/>
-                <w:sz w:val="19"/>
+                <w:sz w:val="17"/>
               </w:rPr>
               <w:t>Figure 10</w:t>
             </w:r>
@@ -3281,9 +3303,9 @@
             <w:r>
               <w:rPr>
                 <w:b w:val="0"/>
-                <w:sz w:val="19"/>
-              </w:rPr>
-              <w:t>Accuracy and macro-F1 of each relation-classification system on the adjudicated gold set</w:t>
+                <w:sz w:val="17"/>
+              </w:rPr>
+              <w:t>The worked example in the console</w:t>
             </w:r>
           </w:p>
         </w:tc>
@@ -3308,180 +3330,6 @@
           </w:p>
         </w:tc>
       </w:tr>
-      <w:tr>
-        <w:tc>
-          <w:tcPr>
-            <w:tcW w:type="dxa" w:w="1152"/>
-          </w:tcPr>
-          <w:p>
-            <w:pPr>
-              <w:spacing w:after="20" w:line="240" w:lineRule="auto"/>
-            </w:pPr>
-            <w:r/>
-            <w:r>
-              <w:rPr>
-                <w:b w:val="0"/>
-                <w:sz w:val="19"/>
-              </w:rPr>
-              <w:t>Figure 11</w:t>
-            </w:r>
-          </w:p>
-        </w:tc>
-        <w:tc>
-          <w:tcPr>
-            <w:tcW w:type="dxa" w:w="6912"/>
-          </w:tcPr>
-          <w:p>
-            <w:pPr>
-              <w:spacing w:after="20" w:line="240" w:lineRule="auto"/>
-            </w:pPr>
-            <w:r/>
-            <w:r>
-              <w:rPr>
-                <w:b w:val="0"/>
-                <w:sz w:val="19"/>
-              </w:rPr>
-              <w:t>Verifier calibration</w:t>
-            </w:r>
-          </w:p>
-        </w:tc>
-        <w:tc>
-          <w:tcPr>
-            <w:tcW w:type="dxa" w:w="1007"/>
-          </w:tcPr>
-          <w:p>
-            <w:pPr>
-              <w:spacing w:after="20" w:line="240" w:lineRule="auto"/>
-              <w:jc w:val="right"/>
-            </w:pPr>
-            <w:r/>
-            <w:fldSimple w:instr=" PAGEREF _figure_11 \h ">
-              <w:r>
-                <w:rPr>
-                  <w:sz w:val="20"/>
-                </w:rPr>
-                <w:t>1</w:t>
-              </w:r>
-            </w:fldSimple>
-          </w:p>
-        </w:tc>
-      </w:tr>
-      <w:tr>
-        <w:tc>
-          <w:tcPr>
-            <w:tcW w:type="dxa" w:w="1152"/>
-          </w:tcPr>
-          <w:p>
-            <w:pPr>
-              <w:spacing w:after="20" w:line="240" w:lineRule="auto"/>
-            </w:pPr>
-            <w:r/>
-            <w:r>
-              <w:rPr>
-                <w:b w:val="0"/>
-                <w:sz w:val="19"/>
-              </w:rPr>
-              <w:t>Figure 12</w:t>
-            </w:r>
-          </w:p>
-        </w:tc>
-        <w:tc>
-          <w:tcPr>
-            <w:tcW w:type="dxa" w:w="6912"/>
-          </w:tcPr>
-          <w:p>
-            <w:pPr>
-              <w:spacing w:after="20" w:line="240" w:lineRule="auto"/>
-            </w:pPr>
-            <w:r/>
-            <w:r>
-              <w:rPr>
-                <w:b w:val="0"/>
-                <w:sz w:val="19"/>
-              </w:rPr>
-              <w:t>Verifier verdicts over extracted claims, by extraction run</w:t>
-            </w:r>
-          </w:p>
-        </w:tc>
-        <w:tc>
-          <w:tcPr>
-            <w:tcW w:type="dxa" w:w="1007"/>
-          </w:tcPr>
-          <w:p>
-            <w:pPr>
-              <w:spacing w:after="20" w:line="240" w:lineRule="auto"/>
-              <w:jc w:val="right"/>
-            </w:pPr>
-            <w:r/>
-            <w:fldSimple w:instr=" PAGEREF _figure_12 \h ">
-              <w:r>
-                <w:rPr>
-                  <w:sz w:val="20"/>
-                </w:rPr>
-                <w:t>1</w:t>
-              </w:r>
-            </w:fldSimple>
-          </w:p>
-        </w:tc>
-      </w:tr>
-      <w:tr>
-        <w:tc>
-          <w:tcPr>
-            <w:tcW w:type="dxa" w:w="1152"/>
-          </w:tcPr>
-          <w:p>
-            <w:pPr>
-              <w:spacing w:after="20" w:line="240" w:lineRule="auto"/>
-            </w:pPr>
-            <w:r/>
-            <w:r>
-              <w:rPr>
-                <w:b w:val="0"/>
-                <w:sz w:val="19"/>
-              </w:rPr>
-              <w:t>Figure 13</w:t>
-            </w:r>
-          </w:p>
-        </w:tc>
-        <w:tc>
-          <w:tcPr>
-            <w:tcW w:type="dxa" w:w="6912"/>
-          </w:tcPr>
-          <w:p>
-            <w:pPr>
-              <w:spacing w:after="20" w:line="240" w:lineRule="auto"/>
-            </w:pPr>
-            <w:r/>
-            <w:r>
-              <w:rPr>
-                <w:b w:val="0"/>
-                <w:sz w:val="19"/>
-              </w:rPr>
-              <w:t>The worked example in the console</w:t>
-            </w:r>
-          </w:p>
-        </w:tc>
-        <w:tc>
-          <w:tcPr>
-            <w:tcW w:type="dxa" w:w="1007"/>
-          </w:tcPr>
-          <w:p>
-            <w:pPr>
-              <w:spacing w:after="20" w:line="240" w:lineRule="auto"/>
-              <w:jc w:val="right"/>
-            </w:pPr>
-            <w:r/>
-            <w:fldSimple w:instr=" PAGEREF _figure_13 \h ">
-              <w:r>
-                <w:rPr>
-                  <w:sz w:val="20"/>
-                </w:rPr>
-                <w:t>1</w:t>
-              </w:r>
-            </w:fldSimple>
-          </w:p>
-        </w:tc>
-      </w:tr>
     </w:tbl>
     <w:p>
       <w:bookmarkStart w:id="1004" w:name="_toc_1_introduction"/>
@@ -3614,7 +3462,7 @@
           <w:i w:val="0"/>
           <w:sz w:val="24"/>
         </w:rPr>
-        <w:t>The work is divided between six agents, each with a narrow job: a Librarian that finds papers, an Extractor that pulls out claims, a Verifier that checks them, a Synthesist that compares papers, a Gap Analyst that looks for missing work, and a Writer. The limits matter as much as the jobs. The Extractor cannot search for anything, so it can only use the text it is given. The Writer cannot check its own output, because a model asked to grade its own work tends to agree with itself. Only the Verifier can run the checking model.</w:t>
+        <w:t>The work is divided between six agents, each with a narrow job: a Librarian that finds papers, an Extractor that pulls out claims, a Verifier that checks them, a Synthesist that compares papers, a Gap Analyst that looks for missing work, and a Writer. The limits matter as much as the jobs: the Extractor cannot search, so it can only use the text it is given, and the Writer cannot check its own output, because a model asked to grade its own work tends to agree with itself. Only the Verifier may run the checking model.</w:t>
       </w:r>
     </w:p>
     <w:p>
@@ -4189,7 +4037,7 @@
           <w:i w:val="0"/>
           <w:sz w:val="24"/>
         </w:rPr>
-        <w:t>Writing a related-work section is the specific task this project is tested on, and it is older than today's models. Abu-Ra'ed and colleagues [15] treated it as summarising the cited papers. Wang and colleagues [16] let the model attend to both the citing paper's own content and the cited abstracts. Luu and colleagues [17] reframed it as explaining the relationship between two papers rather than summarising one, which is the closest existing idea to the relation classifier used here.</w:t>
+        <w:t>Writing a related-work section is older than today's models. Abu-Ra'ed and colleagues [15] treated it as summarising the cited papers; Wang and colleagues [16] attended to both the citing paper's content and the cited abstracts; and Luu and colleagues [17] reframed it as explaining the relationship between two papers, the closest existing idea to the relation classifier used here.</w:t>
       </w:r>
     </w:p>
     <w:p>
@@ -4251,7 +4099,7 @@
           <w:i w:val="0"/>
           <w:sz w:val="24"/>
         </w:rPr>
-        <w:t>Citations are not all the same, and the differences are what a review has to express. Early work looked at whether a citation was positive or negative and at how much surrounding text was needed to tell [21], [22]. Two datasets then made the task standard. ACL-ARC, used by Jurgens and colleagues [23] to trace how a research field changes over time, has six categories. SciCite [24] traded detail for size with three — background, method and result — and showed that training on related side-tasks helps. SciBERT [25], a version of BERT trained on scientific text, is the usual starting point for both, and is the starting point here.</w:t>
+        <w:t>Citations differ, and the differences are what a review must express. Early work looked at citation sentiment and at how much surrounding text was needed [21], [22]. Two datasets made the task standard: ACL-ARC, used by Jurgens and colleagues [23] to trace how a field changes, with six categories; and SciCite [24], which traded detail for size with three. SciBERT [25], a BERT trained on scientific text, is the usual starting point for both and is the starting point here.</w:t>
       </w:r>
     </w:p>
     <w:p>
@@ -4334,7 +4182,7 @@
           <w:i w:val="0"/>
           <w:sz w:val="24"/>
         </w:rPr>
-        <w:t>Working out whether these checks are any good needed human judgement. SummEval [26] re-annotated model outputs and showed how weakly the standard scores track what people actually think. Goyal and Durrett [27] annotated errors in detail and found that different kinds of model fail in different ways. BERTScore [28] is included here as a meaning-based alternative to ROUGE, not as a support check, because it compares generated text against a reference answer rather than against the source.</w:t>
+        <w:t>Judging those checks needed human annotation: SummEval [26] showed how weakly standard scores track human opinion, and Goyal and Durrett [27] found that different model families fail differently. BERTScore [28] is used here as a meaning-based alternative to ROUGE, not as a support check, since it compares against a reference rather than the source.</w:t>
       </w:r>
     </w:p>
     <w:p>
@@ -4355,7 +4203,7 @@
           <w:i w:val="0"/>
           <w:sz w:val="24"/>
         </w:rPr>
-        <w:t>The fact-checking field supplies the other half. FEVER [29] established the pattern of retrieving evidence and then testing whether it supports a claim. SciFact [30] moved that into science, where claims are hedged and evidence is technical. DeBERTa [31] is the model design whose trained versions are used here as the checker. The hallucination survey [2] supplies the wording used throughout this report: a claim is called unsupported when the evidence does not establish it, which is a weaker and more checkable statement than calling it false.</w:t>
+        <w:t>Fact-checking supplies the other half: FEVER [29] established retrieving evidence then testing whether it supports a claim, and SciFact [30] moved that into science, where claims are hedged. DeBERTa [31] is the model design used here as the checker. The hallucination survey [2] supplies this report's wording: a claim is unsupported when the evidence does not establish it, which is weaker and more checkable than calling it false.</w:t>
       </w:r>
     </w:p>
     <w:p>
@@ -4479,7 +4327,7 @@
           <w:i w:val="0"/>
           <w:sz w:val="24"/>
         </w:rPr>
-        <w:t>Retrieval-augmented generation [34], with meaning-based search [35], is the standard way to tie a model's output to documents, and it is what the practical tools are built on. PaperQA [36] answers scientific questions by forcing the answer through retrieved passages, and reports less invention as a result. STORM [37] tackles longer writing: it researches a topic by simulating questions from several points of view, builds an outline, and writes a long article with citations. Sušnjak and colleagues [38] fine-tune subject-specific models for research synthesis and report the practical trade-offs.</w:t>
+        <w:t>Retrieval-augmented generation [34] with meaning-based search [35] is the standard way to tie a model's output to documents, and the practical tools build on it. PaperQA [36] forces answers through retrieved passages and reports less invention; STORM [37] researches a topic from several points of view, builds an outline and writes a long cited article; Sušnjak and colleagues [38] fine-tune subject-specific models for research synthesis.</w:t>
       </w:r>
     </w:p>
     <w:p>
@@ -5581,7 +5429,7 @@
           <w:i w:val="0"/>
           <w:sz w:val="24"/>
         </w:rPr>
-        <w:t>Four trends run through the work above. Checking has moved from comparing against a reference answer towards testing whether the output follows from the source, because reference comparison was shown not to track correctness. What a statement is tied to has got finer, from whole documents towards single passages. Citation types have been standardised, but at a level of detail chosen to make annotation cheap rather than to make the labels useful afterwards. And orchestration has moved from single prompts to teams of agents, usually with self-criticism as the quality mechanism.</w:t>
+        <w:t>Four trends run through the work above. Checking has moved from comparing against a reference answer towards testing whether the output follows from the source. What a statement is tied to has got finer, from whole documents to single passages. Citation types have been standardised, but at a granularity chosen to make annotation cheap rather than the labels useful. And orchestration has moved from single prompts to teams of agents, usually with self-criticism as the quality mechanism.</w:t>
       </w:r>
     </w:p>
     <w:p>
@@ -5859,7 +5707,7 @@
       <w:r>
         <w:rPr>
           <w:i/>
-          <w:sz w:val="19"/>
+          <w:sz w:val="17"/>
         </w:rPr>
         <w:t>Figure 1: How the system fits together. Blue boxes are agents, green boxes are trained models, red boxes are checks, and orange boxes are data or output. One model setting serves every agent and records what every call cost.</w:t>
       </w:r>
@@ -5969,7 +5817,7 @@
       <w:r>
         <w:rPr>
           <w:i/>
-          <w:sz w:val="19"/>
+          <w:sz w:val="17"/>
         </w:rPr>
         <w:t>Figure 2: Mining papers from arXiv. Each paper's source files are stored once, and a paper with no usable source is recorded as such so it is never downloaded twice. That is what lets the step be stopped and restarted.</w:t>
       </w:r>
@@ -6694,7 +6542,7 @@
           <w:i w:val="0"/>
           <w:sz w:val="24"/>
         </w:rPr>
-        <w:t>Gap detection builds a table of how many papers apply each family of method to each dataset. A cell that is empty or nearly empty, where both its row and its column are otherwise busy, becomes a candidate gap. Two method families that both appear on a dataset but between whose papers no comparison link exists become a candidate of a different kind. Because an empty cell is often empty for a good reason, the agent is required to argue both for and against each candidate before giving a verdict, and both arguments are kept in the output.</w:t>
+        <w:t>Gap detection builds a table of how many papers apply each method family to each dataset. An empty or near-empty cell whose row and column are otherwise busy becomes a candidate, as do two families that share a dataset but whose papers never compare against each other. Because a cell is often empty for a good reason, the agent must argue both for and against each candidate before giving a verdict, and both arguments are kept.</w:t>
       </w:r>
     </w:p>
     <w:p>
@@ -6801,7 +6649,7 @@
       <w:r>
         <w:rPr>
           <w:i/>
-          <w:sz w:val="19"/>
+          <w:sz w:val="17"/>
         </w:rPr>
         <w:t>Figure 3: The ten steps, the point where a human approves the paper list, and the single rewrite loop. Every step saves its output before the next begins, so an interrupted run carries on where it stopped.</w:t>
       </w:r>
@@ -6928,7 +6776,7 @@
           <w:i w:val="0"/>
           <w:sz w:val="24"/>
         </w:rPr>
-        <w:t>Overlap with the human text is measured by ROUGE and BERTScore, but reported beside three other measures, because overlap says nothing about whether the text is true. Citation coverage is the share of the papers the human section cited that the generated section discusses at all. Citation correctness is the share of claimed links between a sentence and a paper where that paper's evidence actually supports the sentence; this is the measure that catches a real citation attached to a sentence the paper never supported. Faithfulness is as defined in equation (3.4).</w:t>
+        <w:t>Overlap with the human text is measured by ROUGE and BERTScore, reported beside three other measures because overlap says nothing about truth. Citation coverage is the share of cited papers the generated section discusses at all. Citation correctness is the share of claimed sentence-to-paper links where that paper's evidence really supports the sentence — the measure that catches a real citation attached to a sentence the paper never supported. Faithfulness is equation (3.4).</w:t>
       </w:r>
     </w:p>
     <w:p>
@@ -7079,14 +6927,14 @@
           <w:i w:val="0"/>
           <w:sz w:val="24"/>
         </w:rPr>
-        <w:t>Everything the pipeline writes is a file, which is reliable but hard to read. A small web application was therefore built on top of the same files, so the state of a run and the evidence behind a sentence can be inspected directly. It adds no logic of its own: it reads the same results files this report quotes, through the same module, so the two cannot disagree about a number. Figure 4 shows the overview, which marks a step as pending when its results file does not exist rather than showing an estimate.</w:t>
-      </w:r>
-    </w:p>
-    <w:p>
-      <w:pPr>
-        <w:spacing w:line="240" w:lineRule="auto" w:after="20" w:before="100"/>
-        <w:ind w:left="0" w:firstLine="0"/>
-        <w:jc w:val="center"/>
+        <w:t>Everything the pipeline writes is a file, which is reliable but hard to read, so a small web application was built on the same files. It adds no logic of its own and reads the same result files this report quotes, so the two cannot disagree about a number, and it marks a step pending when its result file is absent rather than showing an estimate. Its most useful view lists the mined test set: opening a paper shows the related-work section its author wrote, hidden from every system and used only for scoring, beside the abstracts that are the only input a system receives. A second view shows a generated review one sentence at a time, underlined by outcome, and brings up the quoted line behind any sentence that is clicked; it is reproduced in Section 4.7. The same data is available to a conversational assistant through a small read-only interface.</w:t>
+      </w:r>
+    </w:p>
+    <w:p>
+      <w:bookmarkStart w:id="1019" w:name="_toc_3_2_system_requirements"/>
+      <w:pPr>
+        <w:spacing w:line="300" w:lineRule="auto"/>
+        <w:jc w:val="both"/>
         <w:rPr>
           <w:b/>
           <w:bCs/>
@@ -7095,65 +6943,37 @@
         </w:rPr>
       </w:pPr>
       <w:r>
-        <w:drawing>
-          <wp:inline xmlns:a="http://schemas.openxmlformats.org/drawingml/2006/main" xmlns:pic="http://schemas.openxmlformats.org/drawingml/2006/picture">
-            <wp:extent cx="4023360" cy="3087929"/>
-            <wp:docPr id="1432113164" name="Picture 1432113164"/>
-            <wp:cNvGraphicFramePr>
-              <a:graphicFrameLocks noChangeAspect="1"/>
-            </wp:cNvGraphicFramePr>
-            <a:graphic>
-              <a:graphicData uri="http://schemas.openxmlformats.org/drawingml/2006/picture">
-                <pic:pic>
-                  <pic:nvPicPr>
-                    <pic:cNvPr id="0" name="fig_console_overview.png"/>
-                    <pic:cNvPicPr/>
-                  </pic:nvPicPr>
-                  <pic:blipFill>
-                    <a:blip r:embed="rId26"/>
-                    <a:stretch>
-                      <a:fillRect/>
-                    </a:stretch>
-                  </pic:blipFill>
-                  <pic:spPr>
-                    <a:xfrm>
-                      <a:off x="0" y="0"/>
-                      <a:ext cx="4023360" cy="3087929"/>
-                    </a:xfrm>
-                    <a:prstGeom prst="rect"/>
-                  </pic:spPr>
-                </pic:pic>
-              </a:graphicData>
-            </a:graphic>
-          </wp:inline>
-        </w:drawing>
-      </w:r>
-    </w:p>
-    <w:p>
-      <w:bookmarkStart w:id="1019" w:name="_figure_4"/>
-      <w:pPr>
-        <w:spacing w:line="240" w:lineRule="auto" w:after="140" w:before="100"/>
-        <w:ind w:left="0" w:firstLine="0"/>
-        <w:jc w:val="center"/>
         <w:rPr>
           <w:b/>
           <w:bCs/>
           <w:sz w:val="24"/>
           <w:szCs w:val="22"/>
         </w:rPr>
-      </w:pPr>
-      <w:r>
-        <w:rPr>
-          <w:i/>
-          <w:sz w:val="19"/>
-        </w:rPr>
-        <w:t>Figure 4: The console's overview. Each step shows real figures from the file it wrote, and a step that has not run is marked pending instead of being filled in with a guess.</w:t>
+        <w:t>3.2</w:t>
+      </w:r>
+      <w:r>
+        <w:rPr>
+          <w:b/>
+          <w:bCs/>
+          <w:sz w:val="24"/>
+          <w:szCs w:val="22"/>
+        </w:rPr>
+        <w:t xml:space="preserve"> </w:t>
+      </w:r>
+      <w:r>
+        <w:rPr>
+          <w:b/>
+          <w:bCs/>
+          <w:sz w:val="24"/>
+          <w:szCs w:val="22"/>
+        </w:rPr>
+        <w:t>System requirements</w:t>
       </w:r>
       <w:bookmarkEnd w:id="1019"/>
     </w:p>
     <w:p>
       <w:pPr>
-        <w:spacing w:line="259" w:lineRule="auto" w:after="50" w:before="100"/>
+        <w:spacing w:line="259" w:lineRule="auto" w:after="50"/>
         <w:ind w:left="0" w:firstLine="360"/>
         <w:jc w:val="both"/>
         <w:rPr>
@@ -7169,163 +6989,11 @@
           <w:i w:val="0"/>
           <w:sz w:val="24"/>
         </w:rPr>
-        <w:t>The most useful view is the test set itself, in Figure 5. Opening a paper shows the related-work section its author actually wrote, which is hidden from every system and used only for scoring, beside the abstracts that are the only input a system receives. References whose abstract could not be found are greyed out. Seeing the two together makes the difficulty of the task concrete in a way a table of scores does not.</w:t>
-      </w:r>
-    </w:p>
-    <w:p>
-      <w:pPr>
-        <w:spacing w:line="240" w:lineRule="auto" w:after="20" w:before="100"/>
-        <w:ind w:left="0" w:firstLine="0"/>
-        <w:jc w:val="center"/>
-        <w:rPr>
-          <w:b/>
-          <w:bCs/>
-          <w:sz w:val="24"/>
-          <w:szCs w:val="22"/>
-        </w:rPr>
-      </w:pPr>
-      <w:r>
-        <w:drawing>
-          <wp:inline xmlns:a="http://schemas.openxmlformats.org/drawingml/2006/main" xmlns:pic="http://schemas.openxmlformats.org/drawingml/2006/picture">
-            <wp:extent cx="4023360" cy="3057754"/>
-            <wp:docPr id="1432113165" name="Picture 1432113165"/>
-            <wp:cNvGraphicFramePr>
-              <a:graphicFrameLocks noChangeAspect="1"/>
-            </wp:cNvGraphicFramePr>
-            <a:graphic>
-              <a:graphicData uri="http://schemas.openxmlformats.org/drawingml/2006/picture">
-                <pic:pic>
-                  <pic:nvPicPr>
-                    <pic:cNvPr id="0" name="fig_console_benchmark.png"/>
-                    <pic:cNvPicPr/>
-                  </pic:nvPicPr>
-                  <pic:blipFill>
-                    <a:blip r:embed="rId27"/>
-                    <a:stretch>
-                      <a:fillRect/>
-                    </a:stretch>
-                  </pic:blipFill>
-                  <pic:spPr>
-                    <a:xfrm>
-                      <a:off x="0" y="0"/>
-                      <a:ext cx="4023360" cy="3057754"/>
-                    </a:xfrm>
-                    <a:prstGeom prst="rect"/>
-                  </pic:spPr>
-                </pic:pic>
-              </a:graphicData>
-            </a:graphic>
-          </wp:inline>
-        </w:drawing>
-      </w:r>
-    </w:p>
-    <w:p>
-      <w:bookmarkStart w:id="1020" w:name="_figure_5"/>
-      <w:pPr>
-        <w:spacing w:line="240" w:lineRule="auto" w:after="140" w:before="100"/>
-        <w:ind w:left="0" w:firstLine="0"/>
-        <w:jc w:val="center"/>
-        <w:rPr>
-          <w:b/>
-          <w:bCs/>
-          <w:sz w:val="24"/>
-          <w:szCs w:val="22"/>
-        </w:rPr>
-      </w:pPr>
-      <w:r>
-        <w:rPr>
-          <w:i/>
-          <w:sz w:val="19"/>
-        </w:rPr>
-        <w:t>Figure 5: A test example in the console: the section the author wrote, above the cited papers' abstracts that are the only input a system is given. Greyed-out entries are references whose abstract could not be retrieved.</w:t>
-      </w:r>
-      <w:bookmarkEnd w:id="1020"/>
-    </w:p>
-    <w:p>
-      <w:pPr>
-        <w:spacing w:line="259" w:lineRule="auto" w:after="50" w:before="100"/>
-        <w:ind w:left="0" w:firstLine="360"/>
-        <w:jc w:val="both"/>
-        <w:rPr>
-          <w:b/>
-          <w:bCs/>
-          <w:sz w:val="24"/>
-          <w:szCs w:val="22"/>
-        </w:rPr>
-      </w:pPr>
-      <w:r>
-        <w:rPr>
-          <w:b w:val="0"/>
-          <w:i w:val="0"/>
-          <w:sz w:val="24"/>
-        </w:rPr>
-        <w:t>A third view shows a generated review one sentence at a time. Clicking a sentence shows the quoted line it was checked against and the score it received, and sentences are underlined green, orange or red according to the outcome. The same information is also available to a conversational assistant through a small read-only interface, so the state of a run can be asked about in words rather than read off a screen.</w:t>
-      </w:r>
-    </w:p>
-    <w:p>
-      <w:bookmarkStart w:id="1021" w:name="_toc_3_2_system_requirements"/>
-      <w:pPr>
-        <w:spacing w:line="300" w:lineRule="auto"/>
-        <w:jc w:val="both"/>
-        <w:rPr>
-          <w:b/>
-          <w:bCs/>
-          <w:sz w:val="24"/>
-          <w:szCs w:val="22"/>
-        </w:rPr>
-      </w:pPr>
-      <w:r>
-        <w:rPr>
-          <w:b/>
-          <w:bCs/>
-          <w:sz w:val="24"/>
-          <w:szCs w:val="22"/>
-        </w:rPr>
-        <w:t>3.2</w:t>
-      </w:r>
-      <w:r>
-        <w:rPr>
-          <w:b/>
-          <w:bCs/>
-          <w:sz w:val="24"/>
-          <w:szCs w:val="22"/>
-        </w:rPr>
-        <w:t xml:space="preserve"> </w:t>
-      </w:r>
-      <w:r>
-        <w:rPr>
-          <w:b/>
-          <w:bCs/>
-          <w:sz w:val="24"/>
-          <w:szCs w:val="22"/>
-        </w:rPr>
-        <w:t>System requirements</w:t>
-      </w:r>
-      <w:bookmarkEnd w:id="1021"/>
-    </w:p>
-    <w:p>
-      <w:pPr>
-        <w:spacing w:line="259" w:lineRule="auto" w:after="50"/>
-        <w:ind w:left="0" w:firstLine="360"/>
-        <w:jc w:val="both"/>
-        <w:rPr>
-          <w:b/>
-          <w:bCs/>
-          <w:sz w:val="24"/>
-          <w:szCs w:val="22"/>
-        </w:rPr>
-      </w:pPr>
-      <w:r>
-        <w:rPr>
-          <w:b w:val="0"/>
-          <w:i w:val="0"/>
-          <w:sz w:val="24"/>
-        </w:rPr>
         <w:t>The project is built to run in two places: a free Google Colab session with a T4 GPU for the heavier steps, and an Apple Silicon laptop for development and for the smaller runs reported in Chapter 4. Table 2 lists what was actually used. The version numbers are the ones recorded while the code ran, not the oldest versions it would tolerate.</w:t>
       </w:r>
     </w:p>
     <w:p>
-      <w:bookmarkStart w:id="1022" w:name="_table_2"/>
+      <w:bookmarkStart w:id="1020" w:name="_table_2"/>
       <w:pPr>
         <w:spacing w:line="240" w:lineRule="auto" w:after="60"/>
         <w:ind w:left="0" w:firstLine="0"/>
@@ -7344,7 +7012,7 @@
         </w:rPr>
         <w:t>Table 2: What the system was run on, and the exact versions used for the results in Chapter 4.</w:t>
       </w:r>
-      <w:bookmarkEnd w:id="1022"/>
+      <w:bookmarkEnd w:id="1020"/>
     </w:p>
     <w:tbl>
       <w:tblPr>
@@ -8402,7 +8070,7 @@
       </w:r>
     </w:p>
     <w:p>
-      <w:bookmarkStart w:id="1023" w:name="_toc_4_analysis_and_discussion"/>
+      <w:bookmarkStart w:id="1021" w:name="_toc_4_analysis_and_discussion"/>
       <w:pPr>
         <w:pageBreakBefore/>
         <w:spacing w:line="300" w:lineRule="auto"/>
@@ -8430,7 +8098,7 @@
         <w:lastRenderedPageBreak/>
         <w:t>CHAPTER 4</w:t>
       </w:r>
-      <w:bookmarkEnd w:id="1023"/>
+      <w:bookmarkEnd w:id="1021"/>
     </w:p>
     <w:p>
       <w:pPr>
@@ -8532,7 +8200,7 @@
           <w:i w:val="0"/>
           <w:sz w:val="24"/>
         </w:rPr>
-        <w:t>References are resolved by identifier first and by title only as a fallback, because an identifier resolves a reference exactly where a title match resolves it merely probably, and because the fallback is what costs money. Of the references cited from related-work sections, 1,124 carried an arXiv identifier and all 1,124 of them resolved through the arXiv API, every one with an abstract; for a corpus mined from arXiv this is also the more authoritative source, since it returns the abstract of the version actually cited. A further 738 carried a DOI, resolved fifty at a time through OpenAlex, of which 198 came back (160 with an abstract). That left 1,830 references with no identifier at all, which had to be resolved by title search; 505 matched above the similarity floor of 88 and 450 of those yielded an abstract. The title-search pass did not finish: OpenAlex's free tier is a small daily budget per key, and it ran out partway through. Every reference resolved so far is cached, so re-running after the reset continues rather than restarts, and the benchmark reported below is therefore a lower bound on what this corpus yields. The gap between finding a reference and being able to read its abstract is the main reason test examples are dropped: a paper can be identified without its abstract being available to redistribute.</w:t>
+        <w:t>References are resolved by identifier first and by title only as a fallback: an identifier resolves a reference exactly where a title match resolves it merely probably, and the fallback is what spends the daily allowance. 1,124 cited references carried an arXiv identifier and all 1,124 resolved through the arXiv API, every one with an abstract — for a corpus mined from arXiv, also the more authoritative source. A further 738 carried a DOI, resolved fifty at a time through OpenAlex, of which 198 came back (160 with an abstract). That left 1,830 references with no identifier at all, which had to be resolved by title search; 505 matched above the similarity floor of 88 and 450 of those yielded an abstract. The title-search pass did not finish: OpenAlex's free tier is a small daily budget per key, and it ran out partway through. Every reference resolved so far is cached, so re-running after the reset continues rather than restarts, and the benchmark reported below is therefore a lower bound on what this corpus yields. The gap between finding a reference and reading its abstract is the main reason test examples are dropped.</w:t>
       </w:r>
     </w:p>
     <w:p>
@@ -8551,7 +8219,7 @@
         <w:drawing>
           <wp:inline xmlns:a="http://schemas.openxmlformats.org/drawingml/2006/main" xmlns:pic="http://schemas.openxmlformats.org/drawingml/2006/picture">
             <wp:extent cx="4023360" cy="2141086"/>
-            <wp:docPr id="1432113166" name="Picture 1432113166"/>
+            <wp:docPr id="1432113164" name="Picture 1432113164"/>
             <wp:cNvGraphicFramePr>
               <a:graphicFrameLocks noChangeAspect="1"/>
             </wp:cNvGraphicFramePr>
@@ -8563,7 +8231,7 @@
                     <pic:cNvPicPr/>
                   </pic:nvPicPr>
                   <pic:blipFill>
-                    <a:blip r:embed="rId28"/>
+                    <a:blip r:embed="rId26"/>
                     <a:stretch>
                       <a:fillRect/>
                     </a:stretch>
@@ -8583,7 +8251,7 @@
       </w:r>
     </w:p>
     <w:p>
-      <w:bookmarkStart w:id="1024" w:name="_figure_6"/>
+      <w:bookmarkStart w:id="1022" w:name="_figure_4"/>
       <w:pPr>
         <w:spacing w:after="140" w:line="240" w:lineRule="auto" w:before="100"/>
         <w:ind w:left="0" w:firstLine="0"/>
@@ -8598,83 +8266,14 @@
       <w:r>
         <w:rPr>
           <w:i/>
-          <w:sz w:val="19"/>
-        </w:rPr>
-        <w:t>Figure 6: Mining yield: papers surviving each step, as counts and as a percentage of the submissions listed.</w:t>
-      </w:r>
-      <w:bookmarkEnd w:id="1024"/>
-    </w:p>
-    <w:p>
-      <w:pPr>
-        <w:spacing w:after="20" w:line="240" w:lineRule="auto" w:before="100"/>
-        <w:ind w:left="0" w:firstLine="0"/>
-        <w:jc w:val="center"/>
-        <w:rPr>
-          <w:b/>
-          <w:bCs/>
-          <w:sz w:val="28"/>
-          <w:szCs w:val="24"/>
-        </w:rPr>
-      </w:pPr>
-      <w:r>
-        <w:drawing>
-          <wp:inline xmlns:a="http://schemas.openxmlformats.org/drawingml/2006/main" xmlns:pic="http://schemas.openxmlformats.org/drawingml/2006/picture">
-            <wp:extent cx="4023360" cy="1280660"/>
-            <wp:docPr id="1432113167" name="Picture 1432113167"/>
-            <wp:cNvGraphicFramePr>
-              <a:graphicFrameLocks noChangeAspect="1"/>
-            </wp:cNvGraphicFramePr>
-            <a:graphic>
-              <a:graphicData uri="http://schemas.openxmlformats.org/drawingml/2006/picture">
-                <pic:pic>
-                  <pic:nvPicPr>
-                    <pic:cNvPr id="0" name="fig_dataset_stats.png"/>
-                    <pic:cNvPicPr/>
-                  </pic:nvPicPr>
-                  <pic:blipFill>
-                    <a:blip r:embed="rId29"/>
-                    <a:stretch>
-                      <a:fillRect/>
-                    </a:stretch>
-                  </pic:blipFill>
-                  <pic:spPr>
-                    <a:xfrm>
-                      <a:off x="0" y="0"/>
-                      <a:ext cx="4023360" cy="1280660"/>
-                    </a:xfrm>
-                    <a:prstGeom prst="rect"/>
-                  </pic:spPr>
-                </pic:pic>
-              </a:graphicData>
-            </a:graphic>
-          </wp:inline>
-        </w:drawing>
-      </w:r>
-    </w:p>
-    <w:p>
-      <w:bookmarkStart w:id="1025" w:name="_figure_7"/>
-      <w:pPr>
-        <w:spacing w:after="140" w:line="240" w:lineRule="auto" w:before="100"/>
-        <w:ind w:left="0" w:firstLine="0"/>
-        <w:jc w:val="center"/>
-        <w:rPr>
-          <w:b/>
-          <w:bCs/>
-          <w:sz w:val="28"/>
-          <w:szCs w:val="24"/>
-        </w:rPr>
-      </w:pPr>
-      <w:r>
-        <w:rPr>
-          <w:i/>
-          <w:sz w:val="19"/>
-        </w:rPr>
-        <w:t>Figure 7: Distribution of related-work length, number of cited papers and abstract coverage across the mined benchmark examples.</w:t>
-      </w:r>
-      <w:bookmarkEnd w:id="1025"/>
-    </w:p>
-    <w:p>
-      <w:bookmarkStart w:id="1026" w:name="_table_3"/>
+          <w:sz w:val="17"/>
+        </w:rPr>
+        <w:t>Figure 4: Mining yield: papers surviving each step, as counts and as a percentage of the submissions listed.</w:t>
+      </w:r>
+      <w:bookmarkEnd w:id="1022"/>
+    </w:p>
+    <w:p>
+      <w:bookmarkStart w:id="1023" w:name="_table_3"/>
       <w:pPr>
         <w:spacing w:after="60" w:line="240" w:lineRule="auto" w:before="100"/>
         <w:ind w:left="0" w:firstLine="0"/>
@@ -8693,7 +8292,7 @@
         </w:rPr>
         <w:t>Table 3: Stage 1 mining yield at pilot scale.</w:t>
       </w:r>
-      <w:bookmarkEnd w:id="1026"/>
+      <w:bookmarkEnd w:id="1023"/>
     </w:p>
     <w:tbl>
       <w:tblPr>
@@ -9068,7 +8667,7 @@
       </w:pPr>
     </w:p>
     <w:p>
-      <w:bookmarkStart w:id="1027" w:name="_table_4"/>
+      <w:bookmarkStart w:id="1024" w:name="_table_4"/>
       <w:pPr>
         <w:spacing w:after="60" w:line="240" w:lineRule="auto" w:before="100"/>
         <w:ind w:left="0" w:firstLine="0"/>
@@ -9087,7 +8686,7 @@
         </w:rPr>
         <w:t>Table 4: Dataset statistics for the mined arXiv benchmark and the external Multi-XScience benchmark.</w:t>
       </w:r>
-      <w:bookmarkEnd w:id="1027"/>
+      <w:bookmarkEnd w:id="1024"/>
     </w:p>
     <w:tbl>
       <w:tblPr>
@@ -9676,7 +9275,7 @@
         <w:drawing>
           <wp:inline xmlns:a="http://schemas.openxmlformats.org/drawingml/2006/main" xmlns:pic="http://schemas.openxmlformats.org/drawingml/2006/picture">
             <wp:extent cx="4023360" cy="1909668"/>
-            <wp:docPr id="1432113168" name="Picture 1432113168"/>
+            <wp:docPr id="1432113165" name="Picture 1432113165"/>
             <wp:cNvGraphicFramePr>
               <a:graphicFrameLocks noChangeAspect="1"/>
             </wp:cNvGraphicFramePr>
@@ -9688,7 +9287,7 @@
                     <pic:cNvPicPr/>
                   </pic:nvPicPr>
                   <pic:blipFill>
-                    <a:blip r:embed="rId30"/>
+                    <a:blip r:embed="rId27"/>
                     <a:stretch>
                       <a:fillRect/>
                     </a:stretch>
@@ -9708,7 +9307,7 @@
       </w:r>
     </w:p>
     <w:p>
-      <w:bookmarkStart w:id="1028" w:name="_figure_8"/>
+      <w:bookmarkStart w:id="1025" w:name="_figure_5"/>
       <w:pPr>
         <w:spacing w:after="140" w:line="240" w:lineRule="auto" w:before="100"/>
         <w:ind w:left="0" w:firstLine="0"/>
@@ -9723,11 +9322,11 @@
       <w:r>
         <w:rPr>
           <w:i/>
-          <w:sz w:val="19"/>
-        </w:rPr>
-        <w:t>Figure 8: Distribution of LLM-assigned citation relations over the labelled pool.</w:t>
-      </w:r>
-      <w:bookmarkEnd w:id="1028"/>
+          <w:sz w:val="17"/>
+        </w:rPr>
+        <w:t>Figure 5: Distribution of LLM-assigned citation relations over the labelled pool.</w:t>
+      </w:r>
+      <w:bookmarkEnd w:id="1025"/>
     </w:p>
     <w:p>
       <w:pPr>
@@ -9751,7 +9350,7 @@
       </w:r>
     </w:p>
     <w:p>
-      <w:bookmarkStart w:id="1029" w:name="_table_5"/>
+      <w:bookmarkStart w:id="1026" w:name="_table_5"/>
       <w:pPr>
         <w:spacing w:after="60" w:line="240" w:lineRule="auto" w:before="100"/>
         <w:ind w:left="0" w:firstLine="0"/>
@@ -9770,7 +9369,7 @@
         </w:rPr>
         <w:t>Table 5: Citation-relation classification on the 200-context adjudicated gold set. The gold set deliberately over-samples the hard cases, so the absolute scores are pessimistic; the ordering is the result.</w:t>
       </w:r>
-      <w:bookmarkEnd w:id="1029"/>
+      <w:bookmarkEnd w:id="1026"/>
     </w:p>
     <w:tbl>
       <w:tblPr>
@@ -10125,7 +9724,7 @@
           <w:i w:val="0"/>
           <w:sz w:val="24"/>
         </w:rPr>
-        <w:t>Per-class, the weakest classes are uses-method (F1 0.00, 3 gold examples) and uses-data (F1 0.00, 2 gold examples). Both are rare in the gold set, and the confusion matrices in Figure 9 shows where their mass goes instead.</w:t>
+        <w:t>Per-class, the weakest classes are uses-method (F1 0.00, 3 gold examples) and uses-data (F1 0.00, 2 gold examples). Both are rare in the gold set, and the confusion matrices in Figure 6 shows where their mass goes instead.</w:t>
       </w:r>
     </w:p>
     <w:p>
@@ -10144,7 +9743,7 @@
         <w:drawing>
           <wp:inline xmlns:a="http://schemas.openxmlformats.org/drawingml/2006/main" xmlns:pic="http://schemas.openxmlformats.org/drawingml/2006/picture">
             <wp:extent cx="4023360" cy="1995587"/>
-            <wp:docPr id="1432113169" name="Picture 1432113169"/>
+            <wp:docPr id="1432113166" name="Picture 1432113166"/>
             <wp:cNvGraphicFramePr>
               <a:graphicFrameLocks noChangeAspect="1"/>
             </wp:cNvGraphicFramePr>
@@ -10156,7 +9755,7 @@
                     <pic:cNvPicPr/>
                   </pic:nvPicPr>
                   <pic:blipFill>
-                    <a:blip r:embed="rId31"/>
+                    <a:blip r:embed="rId28"/>
                     <a:stretch>
                       <a:fillRect/>
                     </a:stretch>
@@ -10176,7 +9775,7 @@
       </w:r>
     </w:p>
     <w:p>
-      <w:bookmarkStart w:id="1030" w:name="_figure_9"/>
+      <w:bookmarkStart w:id="1027" w:name="_figure_6"/>
       <w:pPr>
         <w:spacing w:after="140" w:line="240" w:lineRule="auto" w:before="100"/>
         <w:ind w:left="0" w:firstLine="0"/>
@@ -10191,11 +9790,11 @@
       <w:r>
         <w:rPr>
           <w:i/>
-          <w:sz w:val="19"/>
-        </w:rPr>
-        <w:t>Figure 9: Confusion matrices on the adjudicated gold set, for the LLM labeller and for the fine-tuned classifier. Cell text is the raw count.</w:t>
-      </w:r>
-      <w:bookmarkEnd w:id="1030"/>
+          <w:sz w:val="17"/>
+        </w:rPr>
+        <w:t>Figure 6: Confusion matrices on the adjudicated gold set, for the LLM labeller and for the fine-tuned classifier. Cell text is the raw count.</w:t>
+      </w:r>
+      <w:bookmarkEnd w:id="1027"/>
     </w:p>
     <w:p>
       <w:pPr>
@@ -10213,7 +9812,7 @@
         <w:drawing>
           <wp:inline xmlns:a="http://schemas.openxmlformats.org/drawingml/2006/main" xmlns:pic="http://schemas.openxmlformats.org/drawingml/2006/picture">
             <wp:extent cx="4023360" cy="2064726"/>
-            <wp:docPr id="1432113170" name="Picture 1432113170"/>
+            <wp:docPr id="1432113167" name="Picture 1432113167"/>
             <wp:cNvGraphicFramePr>
               <a:graphicFrameLocks noChangeAspect="1"/>
             </wp:cNvGraphicFramePr>
@@ -10225,7 +9824,7 @@
                     <pic:cNvPicPr/>
                   </pic:nvPicPr>
                   <pic:blipFill>
-                    <a:blip r:embed="rId32"/>
+                    <a:blip r:embed="rId29"/>
                     <a:stretch>
                       <a:fillRect/>
                     </a:stretch>
@@ -10245,7 +9844,7 @@
       </w:r>
     </w:p>
     <w:p>
-      <w:bookmarkStart w:id="1031" w:name="_figure_10"/>
+      <w:bookmarkStart w:id="1028" w:name="_figure_7"/>
       <w:pPr>
         <w:spacing w:after="140" w:line="240" w:lineRule="auto" w:before="100"/>
         <w:ind w:left="0" w:firstLine="0"/>
@@ -10260,11 +9859,11 @@
       <w:r>
         <w:rPr>
           <w:i/>
-          <w:sz w:val="19"/>
-        </w:rPr>
-        <w:t>Figure 10: Accuracy and macro-F1 of each relation-classification system on the adjudicated gold set.</w:t>
-      </w:r>
-      <w:bookmarkEnd w:id="1031"/>
+          <w:sz w:val="17"/>
+        </w:rPr>
+        <w:t>Figure 7: Accuracy and macro-F1 of each relation-classification system on the adjudicated gold set.</w:t>
+      </w:r>
+      <w:bookmarkEnd w:id="1028"/>
     </w:p>
     <w:p>
       <w:pPr>
@@ -10304,7 +9903,7 @@
           <w:i w:val="0"/>
           <w:sz w:val="24"/>
         </w:rPr>
-        <w:t>The two thresholds were chosen by trying every combination on 48 hand-checked claim-and-quote pairs and keeping the one with the best macro-F1 across the three outcomes. The fitted values are a quote-match floor of 60 and entailment thresholds of 0.7 for supported and 0.3 for partially supported, reaching 0.488 macro-F1 on the dev set, against 0.3913 for the hand-chosen defaults. Figure 11 shows the dev items against the fitted boundaries.</w:t>
+        <w:t>The two thresholds were chosen by trying every combination on 48 hand-checked claim-and-quote pairs and keeping the one with the best macro-F1 across the three outcomes. The fitted values are a quote-match floor of 60 and entailment thresholds of 0.7 for supported and 0.3 for partially supported, reaching 0.488 macro-F1 on the dev set, against 0.3913 for the hand-chosen defaults. Figure 8 shows the dev items against the fitted boundaries.</w:t>
       </w:r>
     </w:p>
     <w:p>
@@ -10323,7 +9922,7 @@
         <w:drawing>
           <wp:inline xmlns:a="http://schemas.openxmlformats.org/drawingml/2006/main" xmlns:pic="http://schemas.openxmlformats.org/drawingml/2006/picture">
             <wp:extent cx="4023360" cy="1582676"/>
-            <wp:docPr id="1432113171" name="Picture 1432113171"/>
+            <wp:docPr id="1432113168" name="Picture 1432113168"/>
             <wp:cNvGraphicFramePr>
               <a:graphicFrameLocks noChangeAspect="1"/>
             </wp:cNvGraphicFramePr>
@@ -10335,7 +9934,7 @@
                     <pic:cNvPicPr/>
                   </pic:nvPicPr>
                   <pic:blipFill>
-                    <a:blip r:embed="rId33"/>
+                    <a:blip r:embed="rId30"/>
                     <a:stretch>
                       <a:fillRect/>
                     </a:stretch>
@@ -10355,7 +9954,7 @@
       </w:r>
     </w:p>
     <w:p>
-      <w:bookmarkStart w:id="1032" w:name="_figure_11"/>
+      <w:bookmarkStart w:id="1029" w:name="_figure_8"/>
       <w:pPr>
         <w:spacing w:after="140" w:line="240" w:lineRule="auto" w:before="100"/>
         <w:ind w:left="0" w:firstLine="0"/>
@@ -10370,11 +9969,11 @@
       <w:r>
         <w:rPr>
           <w:i/>
-          <w:sz w:val="19"/>
-        </w:rPr>
-        <w:t>Figure 11: Verifier calibration. Left: each hand-checked dev item by quote score and entailment probability, with the fitted thresholds. Right: the top of the threshold grid.</w:t>
-      </w:r>
-      <w:bookmarkEnd w:id="1032"/>
+          <w:sz w:val="17"/>
+        </w:rPr>
+        <w:t>Figure 8: Verifier calibration. Left: each hand-checked dev item by quote score and entailment probability, with the fitted thresholds. Right: the top of the threshold grid.</w:t>
+      </w:r>
+      <w:bookmarkEnd w:id="1029"/>
     </w:p>
     <w:p>
       <w:pPr>
@@ -10413,7 +10012,7 @@
         <w:drawing>
           <wp:inline xmlns:a="http://schemas.openxmlformats.org/drawingml/2006/main" xmlns:pic="http://schemas.openxmlformats.org/drawingml/2006/picture">
             <wp:extent cx="4023360" cy="1073168"/>
-            <wp:docPr id="1432113172" name="Picture 1432113172"/>
+            <wp:docPr id="1432113169" name="Picture 1432113169"/>
             <wp:cNvGraphicFramePr>
               <a:graphicFrameLocks noChangeAspect="1"/>
             </wp:cNvGraphicFramePr>
@@ -10425,7 +10024,7 @@
                     <pic:cNvPicPr/>
                   </pic:nvPicPr>
                   <pic:blipFill>
-                    <a:blip r:embed="rId34"/>
+                    <a:blip r:embed="rId31"/>
                     <a:stretch>
                       <a:fillRect/>
                     </a:stretch>
@@ -10445,7 +10044,7 @@
       </w:r>
     </w:p>
     <w:p>
-      <w:bookmarkStart w:id="1033" w:name="_figure_12"/>
+      <w:bookmarkStart w:id="1030" w:name="_figure_9"/>
       <w:pPr>
         <w:spacing w:after="140" w:line="240" w:lineRule="auto" w:before="100"/>
         <w:ind w:left="0" w:firstLine="0"/>
@@ -10460,11 +10059,11 @@
       <w:r>
         <w:rPr>
           <w:i/>
-          <w:sz w:val="19"/>
-        </w:rPr>
-        <w:t>Figure 12: Verifier verdicts over extracted claims, by extraction run.</w:t>
-      </w:r>
-      <w:bookmarkEnd w:id="1033"/>
+          <w:sz w:val="17"/>
+        </w:rPr>
+        <w:t>Figure 9: Verifier verdicts over extracted claims, by extraction run.</w:t>
+      </w:r>
+      <w:bookmarkEnd w:id="1030"/>
     </w:p>
     <w:p>
       <w:pPr>
@@ -10732,7 +10331,7 @@
           <w:i w:val="0"/>
           <w:sz w:val="24"/>
         </w:rPr>
-        <w:t>Figure 13 shows the same run in the console, where selecting a sentence brings up the line it was checked against.</w:t>
+        <w:t>Figure 10 shows the same run in the console, where selecting a sentence brings up the line it was checked against.</w:t>
       </w:r>
     </w:p>
     <w:p>
@@ -10751,7 +10350,7 @@
         <w:drawing>
           <wp:inline xmlns:a="http://schemas.openxmlformats.org/drawingml/2006/main" xmlns:pic="http://schemas.openxmlformats.org/drawingml/2006/picture">
             <wp:extent cx="4206240" cy="2523744"/>
-            <wp:docPr id="1432113173" name="Picture 1432113173"/>
+            <wp:docPr id="1432113170" name="Picture 1432113170"/>
             <wp:cNvGraphicFramePr>
               <a:graphicFrameLocks noChangeAspect="1"/>
             </wp:cNvGraphicFramePr>
@@ -10763,7 +10362,7 @@
                     <pic:cNvPicPr/>
                   </pic:nvPicPr>
                   <pic:blipFill>
-                    <a:blip r:embed="rId35"/>
+                    <a:blip r:embed="rId32"/>
                     <a:stretch>
                       <a:fillRect/>
                     </a:stretch>
@@ -10783,7 +10382,7 @@
       </w:r>
     </w:p>
     <w:p>
-      <w:bookmarkStart w:id="1034" w:name="_figure_13"/>
+      <w:bookmarkStart w:id="1031" w:name="_figure_10"/>
       <w:pPr>
         <w:spacing w:after="140" w:line="240" w:lineRule="auto" w:before="100"/>
         <w:ind w:left="0" w:firstLine="0"/>
@@ -10798,11 +10397,11 @@
       <w:r>
         <w:rPr>
           <w:i/>
-          <w:sz w:val="19"/>
-        </w:rPr>
-        <w:t>Figure 13: The worked example in the console. Sentences are underlined by outcome, and selecting one shows the paper it cites, the closest supporting line, and the score. Here every sentence is unsupported.</w:t>
-      </w:r>
-      <w:bookmarkEnd w:id="1034"/>
+          <w:sz w:val="17"/>
+        </w:rPr>
+        <w:t>Figure 10: The worked example in the console. Sentences are underlined by outcome, and selecting one shows the paper it cites, the closest supporting line, and the score. Here every sentence is unsupported.</w:t>
+      </w:r>
+      <w:bookmarkEnd w:id="1031"/>
     </w:p>
     <w:p>
       <w:pPr>
@@ -10930,7 +10529,7 @@
       </w:r>
     </w:p>
     <w:p>
-      <w:bookmarkStart w:id="1035" w:name="_table_6"/>
+      <w:bookmarkStart w:id="1032" w:name="_table_6"/>
       <w:pPr>
         <w:spacing w:after="60" w:line="240" w:lineRule="auto" w:before="140"/>
         <w:ind w:left="0" w:firstLine="0"/>
@@ -10949,7 +10548,7 @@
         </w:rPr>
         <w:t>Table 6: Failure categories counted over every cached generation in the evaluation run.</w:t>
       </w:r>
-      <w:bookmarkEnd w:id="1035"/>
+      <w:bookmarkEnd w:id="1032"/>
     </w:p>
     <w:tbl>
       <w:tblPr>
@@ -10959,8 +10558,9 @@
         <w:tblLook w:firstColumn="1" w:firstRow="1" w:lastColumn="0" w:lastRow="0" w:noHBand="0" w:noVBand="1" w:val="04A0"/>
       </w:tblPr>
       <w:tblGrid>
-        <w:gridCol w:w="4514"/>
-        <w:gridCol w:w="4514"/>
+        <w:gridCol w:w="3010"/>
+        <w:gridCol w:w="3010"/>
+        <w:gridCol w:w="3010"/>
       </w:tblGrid>
       <w:tr>
         <w:tc>
@@ -10999,6 +10599,24 @@
             </w:r>
           </w:p>
         </w:tc>
+        <w:tc>
+          <w:tcPr>
+            <w:tcW w:type="dxa" w:w="1296"/>
+          </w:tcPr>
+          <w:p>
+            <w:pPr>
+              <w:spacing w:after="10" w:before="10" w:line="228" w:lineRule="auto"/>
+            </w:pPr>
+            <w:r/>
+            <w:r>
+              <w:rPr>
+                <w:b/>
+                <w:sz w:val="17"/>
+              </w:rPr>
+              <w:t>S2</w:t>
+            </w:r>
+          </w:p>
+        </w:tc>
       </w:tr>
       <w:tr>
         <w:tc>
@@ -11038,6 +10656,25 @@
             </w:r>
           </w:p>
         </w:tc>
+        <w:tc>
+          <w:tcPr>
+            <w:tcW w:type="dxa" w:w="1296"/>
+          </w:tcPr>
+          <w:p>
+            <w:pPr>
+              <w:spacing w:after="10" w:before="10" w:line="228" w:lineRule="auto"/>
+              <w:jc w:val="right"/>
+            </w:pPr>
+            <w:r/>
+            <w:r>
+              <w:rPr>
+                <w:b w:val="0"/>
+                <w:sz w:val="17"/>
+              </w:rPr>
+              <w:t>2</w:t>
+            </w:r>
+          </w:p>
+        </w:tc>
       </w:tr>
       <w:tr>
         <w:tc>
@@ -11077,6 +10714,25 @@
             </w:r>
           </w:p>
         </w:tc>
+        <w:tc>
+          <w:tcPr>
+            <w:tcW w:type="dxa" w:w="1296"/>
+          </w:tcPr>
+          <w:p>
+            <w:pPr>
+              <w:spacing w:after="10" w:before="10" w:line="228" w:lineRule="auto"/>
+              <w:jc w:val="right"/>
+            </w:pPr>
+            <w:r/>
+            <w:r>
+              <w:rPr>
+                <w:b w:val="0"/>
+                <w:sz w:val="17"/>
+              </w:rPr>
+              <w:t>2</w:t>
+            </w:r>
+          </w:p>
+        </w:tc>
       </w:tr>
       <w:tr>
         <w:tc>
@@ -11112,7 +10768,26 @@
                 <w:b w:val="0"/>
                 <w:sz w:val="17"/>
               </w:rPr>
-              <w:t>7</w:t>
+              <w:t>8</w:t>
+            </w:r>
+          </w:p>
+        </w:tc>
+        <w:tc>
+          <w:tcPr>
+            <w:tcW w:type="dxa" w:w="1296"/>
+          </w:tcPr>
+          <w:p>
+            <w:pPr>
+              <w:spacing w:after="10" w:before="10" w:line="228" w:lineRule="auto"/>
+              <w:jc w:val="right"/>
+            </w:pPr>
+            <w:r/>
+            <w:r>
+              <w:rPr>
+                <w:b w:val="0"/>
+                <w:sz w:val="17"/>
+              </w:rPr>
+              <w:t>0</w:t>
             </w:r>
           </w:p>
         </w:tc>
@@ -11151,7 +10826,26 @@
                 <w:b w:val="0"/>
                 <w:sz w:val="17"/>
               </w:rPr>
-              <w:t>7</w:t>
+              <w:t>8</w:t>
+            </w:r>
+          </w:p>
+        </w:tc>
+        <w:tc>
+          <w:tcPr>
+            <w:tcW w:type="dxa" w:w="1296"/>
+          </w:tcPr>
+          <w:p>
+            <w:pPr>
+              <w:spacing w:after="10" w:before="10" w:line="228" w:lineRule="auto"/>
+              <w:jc w:val="right"/>
+            </w:pPr>
+            <w:r/>
+            <w:r>
+              <w:rPr>
+                <w:b w:val="0"/>
+                <w:sz w:val="17"/>
+              </w:rPr>
+              <w:t>0</w:t>
             </w:r>
           </w:p>
         </w:tc>
@@ -11194,6 +10888,25 @@
             </w:r>
           </w:p>
         </w:tc>
+        <w:tc>
+          <w:tcPr>
+            <w:tcW w:type="dxa" w:w="1296"/>
+          </w:tcPr>
+          <w:p>
+            <w:pPr>
+              <w:spacing w:after="10" w:before="10" w:line="228" w:lineRule="auto"/>
+              <w:jc w:val="right"/>
+            </w:pPr>
+            <w:r/>
+            <w:r>
+              <w:rPr>
+                <w:b w:val="0"/>
+                <w:sz w:val="17"/>
+              </w:rPr>
+              <w:t>0</w:t>
+            </w:r>
+          </w:p>
+        </w:tc>
       </w:tr>
       <w:tr>
         <w:tc>
@@ -11211,6 +10924,25 @@
                 <w:sz w:val="17"/>
               </w:rPr>
               <w:t>revision did not improve faithfulness</w:t>
+            </w:r>
+          </w:p>
+        </w:tc>
+        <w:tc>
+          <w:tcPr>
+            <w:tcW w:type="dxa" w:w="1296"/>
+          </w:tcPr>
+          <w:p>
+            <w:pPr>
+              <w:spacing w:after="10" w:before="10" w:line="228" w:lineRule="auto"/>
+              <w:jc w:val="right"/>
+            </w:pPr>
+            <w:r/>
+            <w:r>
+              <w:rPr>
+                <w:b w:val="0"/>
+                <w:sz w:val="17"/>
+              </w:rPr>
+              <w:t>0</w:t>
             </w:r>
           </w:p>
         </w:tc>
@@ -11437,7 +11169,7 @@
       </w:r>
     </w:p>
     <w:p>
-      <w:bookmarkStart w:id="1036" w:name="_toc_5_conclusion_and_future_scope"/>
+      <w:bookmarkStart w:id="1033" w:name="_toc_5_conclusion_and_future_scope"/>
       <w:pPr>
         <w:pageBreakBefore/>
         <w:spacing w:line="300" w:lineRule="auto"/>
@@ -11465,7 +11197,7 @@
         <w:lastRenderedPageBreak/>
         <w:t>CHAPTER 5</w:t>
       </w:r>
-      <w:bookmarkEnd w:id="1036"/>
+      <w:bookmarkEnd w:id="1033"/>
     </w:p>
     <w:p>
       <w:pPr>
@@ -11525,7 +11257,7 @@
       </w:pPr>
     </w:p>
     <w:p>
-      <w:bookmarkStart w:id="1037" w:name="_toc_5_1_conclusion"/>
+      <w:bookmarkStart w:id="1034" w:name="_toc_5_1_conclusion"/>
       <w:pPr>
         <w:spacing w:line="300" w:lineRule="auto"/>
         <w:jc w:val="both"/>
@@ -11551,7 +11283,7 @@
         </w:rPr>
         <w:t>Conclusion</w:t>
       </w:r>
-      <w:bookmarkEnd w:id="1037"/>
+      <w:bookmarkEnd w:id="1034"/>
     </w:p>
     <w:p>
       <w:pPr>
@@ -11634,7 +11366,7 @@
       </w:r>
     </w:p>
     <w:p>
-      <w:bookmarkStart w:id="1038" w:name="_toc_5_2_suggestions_for_future_directions"/>
+      <w:bookmarkStart w:id="1035" w:name="_toc_5_2_suggestions_for_future_directions"/>
       <w:pPr>
         <w:spacing w:line="300" w:lineRule="auto"/>
         <w:jc w:val="both"/>
@@ -11652,7 +11384,7 @@
         </w:rPr>
         <w:t>5.2 Suggestions for future directions</w:t>
       </w:r>
-      <w:bookmarkEnd w:id="1038"/>
+      <w:bookmarkEnd w:id="1035"/>
     </w:p>
     <w:p>
       <w:pPr>
@@ -11775,7 +11507,7 @@
       </w:r>
     </w:p>
     <w:p>
-      <w:bookmarkStart w:id="1039" w:name="_toc_references"/>
+      <w:bookmarkStart w:id="1036" w:name="_toc_references"/>
       <w:pPr>
         <w:pageBreakBefore/>
         <w:spacing w:line="300" w:lineRule="auto"/>
@@ -11805,7 +11537,7 @@
         </w:rPr>
         <w:t xml:space="preserve"> </w:t>
       </w:r>
-      <w:bookmarkEnd w:id="1039"/>
+      <w:bookmarkEnd w:id="1036"/>
     </w:p>
     <w:p>
       <w:pPr>

</xml_diff>